<commit_message>
Final Draft of sprint 1
</commit_message>
<xml_diff>
--- a/documentation/Meeting Logs/Sprint 1.docx
+++ b/documentation/Meeting Logs/Sprint 1.docx
@@ -2795,9 +2795,11 @@
           <w:numId w:val="22"/>
         </w:numPr>
       </w:pPr>
+      <w:proofErr w:type="spellStart"/>
       <w:r>
         <w:t>FuelPrice</w:t>
       </w:r>
+      <w:proofErr w:type="spellEnd"/>
     </w:p>
     <w:p>
       <w:pPr>
@@ -2806,10 +2808,12 @@
           <w:numId w:val="22"/>
         </w:numPr>
       </w:pPr>
+      <w:proofErr w:type="spellStart"/>
       <w:proofErr w:type="gramStart"/>
       <w:r>
         <w:t>DiscountManager</w:t>
       </w:r>
+      <w:proofErr w:type="spellEnd"/>
       <w:proofErr w:type="gramEnd"/>
     </w:p>
     <w:p>
@@ -2819,9 +2823,11 @@
           <w:numId w:val="22"/>
         </w:numPr>
       </w:pPr>
+      <w:proofErr w:type="spellStart"/>
       <w:r>
         <w:t>MapService</w:t>
       </w:r>
+      <w:proofErr w:type="spellEnd"/>
     </w:p>
     <w:p>
       <w:pPr>
@@ -2830,9 +2836,11 @@
           <w:numId w:val="22"/>
         </w:numPr>
       </w:pPr>
+      <w:proofErr w:type="spellStart"/>
       <w:r>
         <w:t>APIService</w:t>
       </w:r>
+      <w:proofErr w:type="spellEnd"/>
     </w:p>
     <w:p>
       <w:pPr>
@@ -2841,10 +2849,12 @@
           <w:numId w:val="22"/>
         </w:numPr>
       </w:pPr>
+      <w:proofErr w:type="spellStart"/>
       <w:proofErr w:type="gramStart"/>
       <w:r>
         <w:t>CacheManager</w:t>
       </w:r>
+      <w:proofErr w:type="spellEnd"/>
       <w:proofErr w:type="gramEnd"/>
     </w:p>
     <w:p/>
@@ -3775,7 +3785,2879 @@
         <w:t xml:space="preserve"> a Pump will monitor the size of its maintenance backlog and aim to keep it as small as possible. This will be achieved by consistently prioritizing and addressing bugs, technical debt, and post-release issues, helping ensure long-term stability and maintainability of the system.</w:t>
       </w:r>
     </w:p>
-    <w:p/>
+    <w:p>
+      <w:pPr>
+        <w:rPr>
+          <w:b/>
+          <w:bCs/>
+          <w:sz w:val="32"/>
+          <w:szCs w:val="32"/>
+        </w:rPr>
+      </w:pPr>
+      <w:r>
+        <w:rPr>
+          <w:b/>
+          <w:bCs/>
+          <w:sz w:val="32"/>
+          <w:szCs w:val="32"/>
+        </w:rPr>
+        <w:t>ReadMe</w:t>
+      </w:r>
+    </w:p>
+    <w:p>
+      <w:pPr>
+        <w:spacing w:after="240" w:line="240" w:lineRule="auto"/>
+        <w:outlineLvl w:val="0"/>
+        <w:rPr>
+          <w:rFonts w:eastAsia="Times New Roman" w:cs="Segoe UI"/>
+          <w:b/>
+          <w:bCs/>
+          <w:kern w:val="36"/>
+          <w14:ligatures w14:val="none"/>
+        </w:rPr>
+      </w:pPr>
+      <w:r>
+        <w:rPr>
+          <w:rFonts w:eastAsia="Times New Roman" w:cs="Segoe UI"/>
+          <w:b/>
+          <w:bCs/>
+          <w:kern w:val="36"/>
+          <w14:ligatures w14:val="none"/>
+        </w:rPr>
+        <w:t>Find A Pump</w:t>
+      </w:r>
+    </w:p>
+    <w:p>
+      <w:pPr>
+        <w:spacing w:after="240" w:line="240" w:lineRule="auto"/>
+        <w:rPr>
+          <w:rFonts w:eastAsia="Times New Roman" w:cs="Segoe UI"/>
+          <w:kern w:val="0"/>
+          <w14:ligatures w14:val="none"/>
+        </w:rPr>
+      </w:pPr>
+      <w:r>
+        <w:rPr>
+          <w:rFonts w:eastAsia="Times New Roman" w:cs="Segoe UI"/>
+          <w:kern w:val="0"/>
+          <w14:ligatures w14:val="none"/>
+        </w:rPr>
+        <w:t>A full-stack web application that allows users to locate nearby gas stations and compare fuel prices through an interactive map interface.</w:t>
+      </w:r>
+    </w:p>
+    <w:p>
+      <w:pPr>
+        <w:spacing w:before="360" w:after="240" w:line="240" w:lineRule="auto"/>
+        <w:outlineLvl w:val="1"/>
+        <w:rPr>
+          <w:rFonts w:eastAsia="Times New Roman" w:cs="Segoe UI"/>
+          <w:b/>
+          <w:bCs/>
+          <w:kern w:val="0"/>
+          <w14:ligatures w14:val="none"/>
+        </w:rPr>
+      </w:pPr>
+      <w:r>
+        <w:rPr>
+          <w:rFonts w:eastAsia="Times New Roman" w:cs="Segoe UI"/>
+          <w:b/>
+          <w:bCs/>
+          <w:kern w:val="0"/>
+          <w14:ligatures w14:val="none"/>
+        </w:rPr>
+        <w:t>Project Overview</w:t>
+      </w:r>
+    </w:p>
+    <w:p>
+      <w:pPr>
+        <w:spacing w:after="240" w:line="240" w:lineRule="auto"/>
+        <w:rPr>
+          <w:rFonts w:eastAsia="Times New Roman" w:cs="Segoe UI"/>
+          <w:kern w:val="0"/>
+          <w14:ligatures w14:val="none"/>
+        </w:rPr>
+      </w:pPr>
+      <w:r>
+        <w:rPr>
+          <w:rFonts w:eastAsia="Times New Roman" w:cs="Segoe UI"/>
+          <w:b/>
+          <w:bCs/>
+          <w:kern w:val="0"/>
+          <w14:ligatures w14:val="none"/>
+        </w:rPr>
+        <w:t>Find A Pump</w:t>
+      </w:r>
+      <w:r>
+        <w:rPr>
+          <w:rFonts w:eastAsia="Times New Roman" w:cs="Segoe UI"/>
+          <w:kern w:val="0"/>
+          <w14:ligatures w14:val="none"/>
+        </w:rPr>
+        <w:t xml:space="preserve"> is a </w:t>
+      </w:r>
+      <w:proofErr w:type="spellStart"/>
+      <w:r>
+        <w:rPr>
+          <w:rFonts w:eastAsia="Times New Roman" w:cs="Segoe UI"/>
+          <w:kern w:val="0"/>
+          <w14:ligatures w14:val="none"/>
+        </w:rPr>
+        <w:t>monorepo</w:t>
+      </w:r>
+      <w:proofErr w:type="spellEnd"/>
+      <w:r>
+        <w:rPr>
+          <w:rFonts w:eastAsia="Times New Roman" w:cs="Segoe UI"/>
+          <w:kern w:val="0"/>
+          <w14:ligatures w14:val="none"/>
+        </w:rPr>
+        <w:t>-based full-stack application consisting of:</w:t>
+      </w:r>
+    </w:p>
+    <w:p>
+      <w:pPr>
+        <w:numPr>
+          <w:ilvl w:val="0"/>
+          <w:numId w:val="32"/>
+        </w:numPr>
+        <w:spacing w:before="100" w:beforeAutospacing="1" w:after="100" w:afterAutospacing="1" w:line="240" w:lineRule="auto"/>
+        <w:rPr>
+          <w:rFonts w:eastAsia="Times New Roman" w:cs="Segoe UI"/>
+          <w:kern w:val="0"/>
+          <w14:ligatures w14:val="none"/>
+        </w:rPr>
+      </w:pPr>
+      <w:r>
+        <w:rPr>
+          <w:rFonts w:eastAsia="Times New Roman" w:cs="Segoe UI"/>
+          <w:kern w:val="0"/>
+          <w14:ligatures w14:val="none"/>
+        </w:rPr>
+        <w:t>A Next.js frontend</w:t>
+      </w:r>
+    </w:p>
+    <w:p>
+      <w:pPr>
+        <w:numPr>
+          <w:ilvl w:val="0"/>
+          <w:numId w:val="32"/>
+        </w:numPr>
+        <w:spacing w:before="100" w:beforeAutospacing="1" w:after="100" w:afterAutospacing="1" w:line="240" w:lineRule="auto"/>
+        <w:rPr>
+          <w:rFonts w:eastAsia="Times New Roman" w:cs="Segoe UI"/>
+          <w:kern w:val="0"/>
+          <w14:ligatures w14:val="none"/>
+        </w:rPr>
+      </w:pPr>
+      <w:r>
+        <w:rPr>
+          <w:rFonts w:eastAsia="Times New Roman" w:cs="Segoe UI"/>
+          <w:kern w:val="0"/>
+          <w14:ligatures w14:val="none"/>
+        </w:rPr>
+        <w:t>A Node.js + Express backend</w:t>
+      </w:r>
+    </w:p>
+    <w:p>
+      <w:pPr>
+        <w:numPr>
+          <w:ilvl w:val="0"/>
+          <w:numId w:val="32"/>
+        </w:numPr>
+        <w:spacing w:before="100" w:beforeAutospacing="1" w:after="100" w:afterAutospacing="1" w:line="240" w:lineRule="auto"/>
+        <w:rPr>
+          <w:rFonts w:eastAsia="Times New Roman" w:cs="Segoe UI"/>
+          <w:kern w:val="0"/>
+          <w14:ligatures w14:val="none"/>
+        </w:rPr>
+      </w:pPr>
+      <w:r>
+        <w:rPr>
+          <w:rFonts w:eastAsia="Times New Roman" w:cs="Segoe UI"/>
+          <w:kern w:val="0"/>
+          <w14:ligatures w14:val="none"/>
+        </w:rPr>
+        <w:t>A SQLite database managed with Prisma ORM</w:t>
+      </w:r>
+    </w:p>
+    <w:p>
+      <w:pPr>
+        <w:numPr>
+          <w:ilvl w:val="0"/>
+          <w:numId w:val="32"/>
+        </w:numPr>
+        <w:spacing w:before="100" w:beforeAutospacing="1" w:after="100" w:afterAutospacing="1" w:line="240" w:lineRule="auto"/>
+        <w:rPr>
+          <w:rFonts w:eastAsia="Times New Roman" w:cs="Segoe UI"/>
+          <w:kern w:val="0"/>
+          <w14:ligatures w14:val="none"/>
+        </w:rPr>
+      </w:pPr>
+      <w:proofErr w:type="spellStart"/>
+      <w:r>
+        <w:rPr>
+          <w:rFonts w:eastAsia="Times New Roman" w:cs="Segoe UI"/>
+          <w:kern w:val="0"/>
+          <w14:ligatures w14:val="none"/>
+        </w:rPr>
+        <w:t>Turborepo</w:t>
+      </w:r>
+      <w:proofErr w:type="spellEnd"/>
+      <w:r>
+        <w:rPr>
+          <w:rFonts w:eastAsia="Times New Roman" w:cs="Segoe UI"/>
+          <w:kern w:val="0"/>
+          <w14:ligatures w14:val="none"/>
+        </w:rPr>
+        <w:t xml:space="preserve"> for running frontend and backend concurrently</w:t>
+      </w:r>
+    </w:p>
+    <w:p>
+      <w:pPr>
+        <w:spacing w:after="240" w:line="240" w:lineRule="auto"/>
+        <w:rPr>
+          <w:rFonts w:eastAsia="Times New Roman" w:cs="Segoe UI"/>
+          <w:kern w:val="0"/>
+          <w14:ligatures w14:val="none"/>
+        </w:rPr>
+      </w:pPr>
+      <w:r>
+        <w:rPr>
+          <w:rFonts w:eastAsia="Times New Roman" w:cs="Segoe UI"/>
+          <w:kern w:val="0"/>
+          <w14:ligatures w14:val="none"/>
+        </w:rPr>
+        <w:t>The backend follows industry-standard architecture:</w:t>
+      </w:r>
+    </w:p>
+    <w:p>
+      <w:pPr>
+        <w:spacing w:after="240" w:line="240" w:lineRule="auto"/>
+        <w:rPr>
+          <w:rFonts w:eastAsia="Times New Roman" w:cs="Segoe UI"/>
+          <w:kern w:val="0"/>
+          <w14:ligatures w14:val="none"/>
+        </w:rPr>
+      </w:pPr>
+      <w:r>
+        <w:rPr>
+          <w:rFonts w:eastAsia="Times New Roman" w:cs="Segoe UI"/>
+          <w:kern w:val="0"/>
+          <w14:ligatures w14:val="none"/>
+        </w:rPr>
+        <w:t>Routes → Controllers → Services</w:t>
+      </w:r>
+    </w:p>
+    <w:p>
+      <w:pPr>
+        <w:spacing w:after="240" w:line="240" w:lineRule="auto"/>
+        <w:rPr>
+          <w:rFonts w:eastAsia="Times New Roman" w:cs="Segoe UI"/>
+          <w:kern w:val="0"/>
+          <w14:ligatures w14:val="none"/>
+        </w:rPr>
+      </w:pPr>
+      <w:r>
+        <w:rPr>
+          <w:rFonts w:eastAsia="Times New Roman" w:cs="Segoe UI"/>
+          <w:kern w:val="0"/>
+          <w14:ligatures w14:val="none"/>
+        </w:rPr>
+        <w:t>This separation ensures:</w:t>
+      </w:r>
+    </w:p>
+    <w:p>
+      <w:pPr>
+        <w:numPr>
+          <w:ilvl w:val="0"/>
+          <w:numId w:val="33"/>
+        </w:numPr>
+        <w:spacing w:before="100" w:beforeAutospacing="1" w:after="100" w:afterAutospacing="1" w:line="240" w:lineRule="auto"/>
+        <w:rPr>
+          <w:rFonts w:eastAsia="Times New Roman" w:cs="Segoe UI"/>
+          <w:kern w:val="0"/>
+          <w14:ligatures w14:val="none"/>
+        </w:rPr>
+      </w:pPr>
+      <w:r>
+        <w:rPr>
+          <w:rFonts w:eastAsia="Times New Roman" w:cs="Segoe UI"/>
+          <w:kern w:val="0"/>
+          <w14:ligatures w14:val="none"/>
+        </w:rPr>
+        <w:t>Routes define endpoints only</w:t>
+      </w:r>
+    </w:p>
+    <w:p>
+      <w:pPr>
+        <w:numPr>
+          <w:ilvl w:val="0"/>
+          <w:numId w:val="33"/>
+        </w:numPr>
+        <w:spacing w:before="100" w:beforeAutospacing="1" w:after="100" w:afterAutospacing="1" w:line="240" w:lineRule="auto"/>
+        <w:rPr>
+          <w:rFonts w:eastAsia="Times New Roman" w:cs="Segoe UI"/>
+          <w:kern w:val="0"/>
+          <w14:ligatures w14:val="none"/>
+        </w:rPr>
+      </w:pPr>
+      <w:r>
+        <w:rPr>
+          <w:rFonts w:eastAsia="Times New Roman" w:cs="Segoe UI"/>
+          <w:kern w:val="0"/>
+          <w14:ligatures w14:val="none"/>
+        </w:rPr>
+        <w:t>Controllers handle validation and HTTP responses</w:t>
+      </w:r>
+    </w:p>
+    <w:p>
+      <w:pPr>
+        <w:numPr>
+          <w:ilvl w:val="0"/>
+          <w:numId w:val="33"/>
+        </w:numPr>
+        <w:spacing w:before="100" w:beforeAutospacing="1" w:after="100" w:afterAutospacing="1" w:line="240" w:lineRule="auto"/>
+        <w:rPr>
+          <w:rFonts w:eastAsia="Times New Roman" w:cs="Segoe UI"/>
+          <w:kern w:val="0"/>
+          <w14:ligatures w14:val="none"/>
+        </w:rPr>
+      </w:pPr>
+      <w:r>
+        <w:rPr>
+          <w:rFonts w:eastAsia="Times New Roman" w:cs="Segoe UI"/>
+          <w:kern w:val="0"/>
+          <w14:ligatures w14:val="none"/>
+        </w:rPr>
+        <w:t>Services contain business logic and database operations</w:t>
+      </w:r>
+    </w:p>
+    <w:p>
+      <w:pPr>
+        <w:spacing w:before="360" w:after="240" w:line="240" w:lineRule="auto"/>
+        <w:outlineLvl w:val="1"/>
+        <w:rPr>
+          <w:rFonts w:eastAsia="Times New Roman" w:cs="Segoe UI"/>
+          <w:b/>
+          <w:bCs/>
+          <w:kern w:val="0"/>
+          <w14:ligatures w14:val="none"/>
+        </w:rPr>
+      </w:pPr>
+      <w:r>
+        <w:rPr>
+          <w:rFonts w:eastAsia="Times New Roman" w:cs="Segoe UI"/>
+          <w:b/>
+          <w:bCs/>
+          <w:kern w:val="0"/>
+          <w14:ligatures w14:val="none"/>
+        </w:rPr>
+        <w:t>Repository Structure</w:t>
+      </w:r>
+    </w:p>
+    <w:p>
+      <w:pPr>
+        <w:pBdr>
+          <w:top w:val="single" w:sz="6" w:space="12" w:color="313131"/>
+          <w:left w:val="single" w:sz="6" w:space="12" w:color="313131"/>
+          <w:bottom w:val="single" w:sz="6" w:space="12" w:color="313131"/>
+          <w:right w:val="single" w:sz="6" w:space="12" w:color="313131"/>
+        </w:pBdr>
+        <w:shd w:val="clear" w:color="auto" w:fill="2B2B2B"/>
+        <w:tabs>
+          <w:tab w:val="left" w:pos="916"/>
+          <w:tab w:val="left" w:pos="1832"/>
+          <w:tab w:val="left" w:pos="2748"/>
+          <w:tab w:val="left" w:pos="3664"/>
+          <w:tab w:val="left" w:pos="4580"/>
+          <w:tab w:val="left" w:pos="5496"/>
+          <w:tab w:val="left" w:pos="6412"/>
+          <w:tab w:val="left" w:pos="7328"/>
+          <w:tab w:val="left" w:pos="8244"/>
+          <w:tab w:val="left" w:pos="9160"/>
+          <w:tab w:val="left" w:pos="10076"/>
+          <w:tab w:val="left" w:pos="10992"/>
+          <w:tab w:val="left" w:pos="11908"/>
+          <w:tab w:val="left" w:pos="12824"/>
+          <w:tab w:val="left" w:pos="13740"/>
+          <w:tab w:val="left" w:pos="14656"/>
+        </w:tabs>
+        <w:spacing w:after="0" w:line="326" w:lineRule="atLeast"/>
+        <w:rPr>
+          <w:rFonts w:eastAsia="Times New Roman" w:cs="Courier New"/>
+          <w:kern w:val="0"/>
+          <w14:ligatures w14:val="none"/>
+        </w:rPr>
+      </w:pPr>
+      <w:r>
+        <w:rPr>
+          <w:rFonts w:eastAsia="Times New Roman" w:cs="Courier New"/>
+          <w:kern w:val="0"/>
+          <w14:ligatures w14:val="none"/>
+        </w:rPr>
+        <w:t>Find-A-Pump-Project/</w:t>
+      </w:r>
+    </w:p>
+    <w:p>
+      <w:pPr>
+        <w:pBdr>
+          <w:top w:val="single" w:sz="6" w:space="12" w:color="313131"/>
+          <w:left w:val="single" w:sz="6" w:space="12" w:color="313131"/>
+          <w:bottom w:val="single" w:sz="6" w:space="12" w:color="313131"/>
+          <w:right w:val="single" w:sz="6" w:space="12" w:color="313131"/>
+        </w:pBdr>
+        <w:shd w:val="clear" w:color="auto" w:fill="2B2B2B"/>
+        <w:tabs>
+          <w:tab w:val="left" w:pos="916"/>
+          <w:tab w:val="left" w:pos="1832"/>
+          <w:tab w:val="left" w:pos="2748"/>
+          <w:tab w:val="left" w:pos="3664"/>
+          <w:tab w:val="left" w:pos="4580"/>
+          <w:tab w:val="left" w:pos="5496"/>
+          <w:tab w:val="left" w:pos="6412"/>
+          <w:tab w:val="left" w:pos="7328"/>
+          <w:tab w:val="left" w:pos="8244"/>
+          <w:tab w:val="left" w:pos="9160"/>
+          <w:tab w:val="left" w:pos="10076"/>
+          <w:tab w:val="left" w:pos="10992"/>
+          <w:tab w:val="left" w:pos="11908"/>
+          <w:tab w:val="left" w:pos="12824"/>
+          <w:tab w:val="left" w:pos="13740"/>
+          <w:tab w:val="left" w:pos="14656"/>
+        </w:tabs>
+        <w:spacing w:after="0" w:line="326" w:lineRule="atLeast"/>
+        <w:rPr>
+          <w:rFonts w:eastAsia="Times New Roman" w:cs="Courier New"/>
+          <w:kern w:val="0"/>
+          <w14:ligatures w14:val="none"/>
+        </w:rPr>
+      </w:pPr>
+      <w:r>
+        <w:rPr>
+          <w:rFonts w:eastAsia="Times New Roman" w:cs="Courier New"/>
+          <w:kern w:val="0"/>
+          <w14:ligatures w14:val="none"/>
+        </w:rPr>
+        <w:t>│</w:t>
+      </w:r>
+    </w:p>
+    <w:p>
+      <w:pPr>
+        <w:pBdr>
+          <w:top w:val="single" w:sz="6" w:space="12" w:color="313131"/>
+          <w:left w:val="single" w:sz="6" w:space="12" w:color="313131"/>
+          <w:bottom w:val="single" w:sz="6" w:space="12" w:color="313131"/>
+          <w:right w:val="single" w:sz="6" w:space="12" w:color="313131"/>
+        </w:pBdr>
+        <w:shd w:val="clear" w:color="auto" w:fill="2B2B2B"/>
+        <w:tabs>
+          <w:tab w:val="left" w:pos="916"/>
+          <w:tab w:val="left" w:pos="1832"/>
+          <w:tab w:val="left" w:pos="2748"/>
+          <w:tab w:val="left" w:pos="3664"/>
+          <w:tab w:val="left" w:pos="4580"/>
+          <w:tab w:val="left" w:pos="5496"/>
+          <w:tab w:val="left" w:pos="6412"/>
+          <w:tab w:val="left" w:pos="7328"/>
+          <w:tab w:val="left" w:pos="8244"/>
+          <w:tab w:val="left" w:pos="9160"/>
+          <w:tab w:val="left" w:pos="10076"/>
+          <w:tab w:val="left" w:pos="10992"/>
+          <w:tab w:val="left" w:pos="11908"/>
+          <w:tab w:val="left" w:pos="12824"/>
+          <w:tab w:val="left" w:pos="13740"/>
+          <w:tab w:val="left" w:pos="14656"/>
+        </w:tabs>
+        <w:spacing w:after="0" w:line="326" w:lineRule="atLeast"/>
+        <w:rPr>
+          <w:rFonts w:eastAsia="Times New Roman" w:cs="Courier New"/>
+          <w:kern w:val="0"/>
+          <w14:ligatures w14:val="none"/>
+        </w:rPr>
+      </w:pPr>
+      <w:r>
+        <w:rPr>
+          <w:rFonts w:ascii="MS Gothic" w:eastAsia="MS Gothic" w:hAnsi="MS Gothic" w:cs="MS Gothic" w:hint="eastAsia"/>
+          <w:kern w:val="0"/>
+          <w14:ligatures w14:val="none"/>
+        </w:rPr>
+        <w:t>├</w:t>
+      </w:r>
+      <w:r>
+        <w:rPr>
+          <w:rFonts w:ascii="Aptos" w:eastAsia="Times New Roman" w:hAnsi="Aptos" w:cs="Aptos"/>
+          <w:kern w:val="0"/>
+          <w14:ligatures w14:val="none"/>
+        </w:rPr>
+        <w:t>──</w:t>
+      </w:r>
+      <w:r>
+        <w:rPr>
+          <w:rFonts w:eastAsia="Times New Roman" w:cs="Courier New"/>
+          <w:kern w:val="0"/>
+          <w14:ligatures w14:val="none"/>
+        </w:rPr>
+        <w:t xml:space="preserve"> documentation/</w:t>
+      </w:r>
+    </w:p>
+    <w:p>
+      <w:pPr>
+        <w:pBdr>
+          <w:top w:val="single" w:sz="6" w:space="12" w:color="313131"/>
+          <w:left w:val="single" w:sz="6" w:space="12" w:color="313131"/>
+          <w:bottom w:val="single" w:sz="6" w:space="12" w:color="313131"/>
+          <w:right w:val="single" w:sz="6" w:space="12" w:color="313131"/>
+        </w:pBdr>
+        <w:shd w:val="clear" w:color="auto" w:fill="2B2B2B"/>
+        <w:tabs>
+          <w:tab w:val="left" w:pos="916"/>
+          <w:tab w:val="left" w:pos="1832"/>
+          <w:tab w:val="left" w:pos="2748"/>
+          <w:tab w:val="left" w:pos="3664"/>
+          <w:tab w:val="left" w:pos="4580"/>
+          <w:tab w:val="left" w:pos="5496"/>
+          <w:tab w:val="left" w:pos="6412"/>
+          <w:tab w:val="left" w:pos="7328"/>
+          <w:tab w:val="left" w:pos="8244"/>
+          <w:tab w:val="left" w:pos="9160"/>
+          <w:tab w:val="left" w:pos="10076"/>
+          <w:tab w:val="left" w:pos="10992"/>
+          <w:tab w:val="left" w:pos="11908"/>
+          <w:tab w:val="left" w:pos="12824"/>
+          <w:tab w:val="left" w:pos="13740"/>
+          <w:tab w:val="left" w:pos="14656"/>
+        </w:tabs>
+        <w:spacing w:after="0" w:line="326" w:lineRule="atLeast"/>
+        <w:rPr>
+          <w:rFonts w:eastAsia="Times New Roman" w:cs="Courier New"/>
+          <w:kern w:val="0"/>
+          <w14:ligatures w14:val="none"/>
+        </w:rPr>
+      </w:pPr>
+      <w:r>
+        <w:rPr>
+          <w:rFonts w:ascii="MS Gothic" w:eastAsia="MS Gothic" w:hAnsi="MS Gothic" w:cs="MS Gothic" w:hint="eastAsia"/>
+          <w:kern w:val="0"/>
+          <w14:ligatures w14:val="none"/>
+        </w:rPr>
+        <w:t>├</w:t>
+      </w:r>
+      <w:r>
+        <w:rPr>
+          <w:rFonts w:ascii="Aptos" w:eastAsia="Times New Roman" w:hAnsi="Aptos" w:cs="Aptos"/>
+          <w:kern w:val="0"/>
+          <w14:ligatures w14:val="none"/>
+        </w:rPr>
+        <w:t>──</w:t>
+      </w:r>
+      <w:r>
+        <w:rPr>
+          <w:rFonts w:eastAsia="Times New Roman" w:cs="Courier New"/>
+          <w:kern w:val="0"/>
+          <w14:ligatures w14:val="none"/>
+        </w:rPr>
+        <w:t xml:space="preserve"> find-a-pump-code/</w:t>
+      </w:r>
+    </w:p>
+    <w:p>
+      <w:pPr>
+        <w:pBdr>
+          <w:top w:val="single" w:sz="6" w:space="12" w:color="313131"/>
+          <w:left w:val="single" w:sz="6" w:space="12" w:color="313131"/>
+          <w:bottom w:val="single" w:sz="6" w:space="12" w:color="313131"/>
+          <w:right w:val="single" w:sz="6" w:space="12" w:color="313131"/>
+        </w:pBdr>
+        <w:shd w:val="clear" w:color="auto" w:fill="2B2B2B"/>
+        <w:tabs>
+          <w:tab w:val="left" w:pos="916"/>
+          <w:tab w:val="left" w:pos="1832"/>
+          <w:tab w:val="left" w:pos="2748"/>
+          <w:tab w:val="left" w:pos="3664"/>
+          <w:tab w:val="left" w:pos="4580"/>
+          <w:tab w:val="left" w:pos="5496"/>
+          <w:tab w:val="left" w:pos="6412"/>
+          <w:tab w:val="left" w:pos="7328"/>
+          <w:tab w:val="left" w:pos="8244"/>
+          <w:tab w:val="left" w:pos="9160"/>
+          <w:tab w:val="left" w:pos="10076"/>
+          <w:tab w:val="left" w:pos="10992"/>
+          <w:tab w:val="left" w:pos="11908"/>
+          <w:tab w:val="left" w:pos="12824"/>
+          <w:tab w:val="left" w:pos="13740"/>
+          <w:tab w:val="left" w:pos="14656"/>
+        </w:tabs>
+        <w:spacing w:after="0" w:line="326" w:lineRule="atLeast"/>
+        <w:rPr>
+          <w:rFonts w:eastAsia="Times New Roman" w:cs="Courier New"/>
+          <w:kern w:val="0"/>
+          <w14:ligatures w14:val="none"/>
+        </w:rPr>
+      </w:pPr>
+      <w:r>
+        <w:rPr>
+          <w:rFonts w:eastAsia="Times New Roman" w:cs="Courier New"/>
+          <w:kern w:val="0"/>
+          <w14:ligatures w14:val="none"/>
+        </w:rPr>
+        <w:t xml:space="preserve">│   </w:t>
+      </w:r>
+      <w:r>
+        <w:rPr>
+          <w:rFonts w:ascii="MS Gothic" w:eastAsia="MS Gothic" w:hAnsi="MS Gothic" w:cs="MS Gothic" w:hint="eastAsia"/>
+          <w:kern w:val="0"/>
+          <w14:ligatures w14:val="none"/>
+        </w:rPr>
+        <w:t>├</w:t>
+      </w:r>
+      <w:r>
+        <w:rPr>
+          <w:rFonts w:ascii="Aptos" w:eastAsia="Times New Roman" w:hAnsi="Aptos" w:cs="Aptos"/>
+          <w:kern w:val="0"/>
+          <w14:ligatures w14:val="none"/>
+        </w:rPr>
+        <w:t>──</w:t>
+      </w:r>
+      <w:r>
+        <w:rPr>
+          <w:rFonts w:eastAsia="Times New Roman" w:cs="Courier New"/>
+          <w:kern w:val="0"/>
+          <w14:ligatures w14:val="none"/>
+        </w:rPr>
+        <w:t xml:space="preserve"> apps/</w:t>
+      </w:r>
+    </w:p>
+    <w:p>
+      <w:pPr>
+        <w:pBdr>
+          <w:top w:val="single" w:sz="6" w:space="12" w:color="313131"/>
+          <w:left w:val="single" w:sz="6" w:space="12" w:color="313131"/>
+          <w:bottom w:val="single" w:sz="6" w:space="12" w:color="313131"/>
+          <w:right w:val="single" w:sz="6" w:space="12" w:color="313131"/>
+        </w:pBdr>
+        <w:shd w:val="clear" w:color="auto" w:fill="2B2B2B"/>
+        <w:tabs>
+          <w:tab w:val="left" w:pos="916"/>
+          <w:tab w:val="left" w:pos="1832"/>
+          <w:tab w:val="left" w:pos="2748"/>
+          <w:tab w:val="left" w:pos="3664"/>
+          <w:tab w:val="left" w:pos="4580"/>
+          <w:tab w:val="left" w:pos="5496"/>
+          <w:tab w:val="left" w:pos="6412"/>
+          <w:tab w:val="left" w:pos="7328"/>
+          <w:tab w:val="left" w:pos="8244"/>
+          <w:tab w:val="left" w:pos="9160"/>
+          <w:tab w:val="left" w:pos="10076"/>
+          <w:tab w:val="left" w:pos="10992"/>
+          <w:tab w:val="left" w:pos="11908"/>
+          <w:tab w:val="left" w:pos="12824"/>
+          <w:tab w:val="left" w:pos="13740"/>
+          <w:tab w:val="left" w:pos="14656"/>
+        </w:tabs>
+        <w:spacing w:after="0" w:line="326" w:lineRule="atLeast"/>
+        <w:rPr>
+          <w:rFonts w:eastAsia="Times New Roman" w:cs="Courier New"/>
+          <w:kern w:val="0"/>
+          <w14:ligatures w14:val="none"/>
+        </w:rPr>
+      </w:pPr>
+      <w:r>
+        <w:rPr>
+          <w:rFonts w:eastAsia="Times New Roman" w:cs="Courier New"/>
+          <w:kern w:val="0"/>
+          <w14:ligatures w14:val="none"/>
+        </w:rPr>
+        <w:t xml:space="preserve">│   │   </w:t>
+      </w:r>
+      <w:r>
+        <w:rPr>
+          <w:rFonts w:ascii="MS Gothic" w:eastAsia="MS Gothic" w:hAnsi="MS Gothic" w:cs="MS Gothic" w:hint="eastAsia"/>
+          <w:kern w:val="0"/>
+          <w14:ligatures w14:val="none"/>
+        </w:rPr>
+        <w:t>├</w:t>
+      </w:r>
+      <w:r>
+        <w:rPr>
+          <w:rFonts w:ascii="Aptos" w:eastAsia="Times New Roman" w:hAnsi="Aptos" w:cs="Aptos"/>
+          <w:kern w:val="0"/>
+          <w14:ligatures w14:val="none"/>
+        </w:rPr>
+        <w:t>──</w:t>
+      </w:r>
+      <w:r>
+        <w:rPr>
+          <w:rFonts w:eastAsia="Times New Roman" w:cs="Courier New"/>
+          <w:kern w:val="0"/>
+          <w14:ligatures w14:val="none"/>
+        </w:rPr>
+        <w:t xml:space="preserve"> frontend/</w:t>
+      </w:r>
+    </w:p>
+    <w:p>
+      <w:pPr>
+        <w:pBdr>
+          <w:top w:val="single" w:sz="6" w:space="12" w:color="313131"/>
+          <w:left w:val="single" w:sz="6" w:space="12" w:color="313131"/>
+          <w:bottom w:val="single" w:sz="6" w:space="12" w:color="313131"/>
+          <w:right w:val="single" w:sz="6" w:space="12" w:color="313131"/>
+        </w:pBdr>
+        <w:shd w:val="clear" w:color="auto" w:fill="2B2B2B"/>
+        <w:tabs>
+          <w:tab w:val="left" w:pos="916"/>
+          <w:tab w:val="left" w:pos="1832"/>
+          <w:tab w:val="left" w:pos="2748"/>
+          <w:tab w:val="left" w:pos="3664"/>
+          <w:tab w:val="left" w:pos="4580"/>
+          <w:tab w:val="left" w:pos="5496"/>
+          <w:tab w:val="left" w:pos="6412"/>
+          <w:tab w:val="left" w:pos="7328"/>
+          <w:tab w:val="left" w:pos="8244"/>
+          <w:tab w:val="left" w:pos="9160"/>
+          <w:tab w:val="left" w:pos="10076"/>
+          <w:tab w:val="left" w:pos="10992"/>
+          <w:tab w:val="left" w:pos="11908"/>
+          <w:tab w:val="left" w:pos="12824"/>
+          <w:tab w:val="left" w:pos="13740"/>
+          <w:tab w:val="left" w:pos="14656"/>
+        </w:tabs>
+        <w:spacing w:after="0" w:line="326" w:lineRule="atLeast"/>
+        <w:rPr>
+          <w:rFonts w:eastAsia="Times New Roman" w:cs="Courier New"/>
+          <w:kern w:val="0"/>
+          <w14:ligatures w14:val="none"/>
+        </w:rPr>
+      </w:pPr>
+      <w:r>
+        <w:rPr>
+          <w:rFonts w:eastAsia="Times New Roman" w:cs="Courier New"/>
+          <w:kern w:val="0"/>
+          <w14:ligatures w14:val="none"/>
+        </w:rPr>
+        <w:t>│   │   └── backend/</w:t>
+      </w:r>
+    </w:p>
+    <w:p>
+      <w:pPr>
+        <w:pBdr>
+          <w:top w:val="single" w:sz="6" w:space="12" w:color="313131"/>
+          <w:left w:val="single" w:sz="6" w:space="12" w:color="313131"/>
+          <w:bottom w:val="single" w:sz="6" w:space="12" w:color="313131"/>
+          <w:right w:val="single" w:sz="6" w:space="12" w:color="313131"/>
+        </w:pBdr>
+        <w:shd w:val="clear" w:color="auto" w:fill="2B2B2B"/>
+        <w:tabs>
+          <w:tab w:val="left" w:pos="916"/>
+          <w:tab w:val="left" w:pos="1832"/>
+          <w:tab w:val="left" w:pos="2748"/>
+          <w:tab w:val="left" w:pos="3664"/>
+          <w:tab w:val="left" w:pos="4580"/>
+          <w:tab w:val="left" w:pos="5496"/>
+          <w:tab w:val="left" w:pos="6412"/>
+          <w:tab w:val="left" w:pos="7328"/>
+          <w:tab w:val="left" w:pos="8244"/>
+          <w:tab w:val="left" w:pos="9160"/>
+          <w:tab w:val="left" w:pos="10076"/>
+          <w:tab w:val="left" w:pos="10992"/>
+          <w:tab w:val="left" w:pos="11908"/>
+          <w:tab w:val="left" w:pos="12824"/>
+          <w:tab w:val="left" w:pos="13740"/>
+          <w:tab w:val="left" w:pos="14656"/>
+        </w:tabs>
+        <w:spacing w:after="0" w:line="326" w:lineRule="atLeast"/>
+        <w:rPr>
+          <w:rFonts w:eastAsia="Times New Roman" w:cs="Courier New"/>
+          <w:kern w:val="0"/>
+          <w14:ligatures w14:val="none"/>
+        </w:rPr>
+      </w:pPr>
+      <w:r>
+        <w:rPr>
+          <w:rFonts w:eastAsia="Times New Roman" w:cs="Courier New"/>
+          <w:kern w:val="0"/>
+          <w14:ligatures w14:val="none"/>
+        </w:rPr>
+        <w:t xml:space="preserve">│   </w:t>
+      </w:r>
+      <w:r>
+        <w:rPr>
+          <w:rFonts w:ascii="MS Gothic" w:eastAsia="MS Gothic" w:hAnsi="MS Gothic" w:cs="MS Gothic" w:hint="eastAsia"/>
+          <w:kern w:val="0"/>
+          <w14:ligatures w14:val="none"/>
+        </w:rPr>
+        <w:t>├</w:t>
+      </w:r>
+      <w:r>
+        <w:rPr>
+          <w:rFonts w:ascii="Aptos" w:eastAsia="Times New Roman" w:hAnsi="Aptos" w:cs="Aptos"/>
+          <w:kern w:val="0"/>
+          <w14:ligatures w14:val="none"/>
+        </w:rPr>
+        <w:t>──</w:t>
+      </w:r>
+      <w:r>
+        <w:rPr>
+          <w:rFonts w:eastAsia="Times New Roman" w:cs="Courier New"/>
+          <w:kern w:val="0"/>
+          <w14:ligatures w14:val="none"/>
+        </w:rPr>
+        <w:t xml:space="preserve"> </w:t>
+      </w:r>
+      <w:proofErr w:type="spellStart"/>
+      <w:r>
+        <w:rPr>
+          <w:rFonts w:eastAsia="Times New Roman" w:cs="Courier New"/>
+          <w:kern w:val="0"/>
+          <w14:ligatures w14:val="none"/>
+        </w:rPr>
+        <w:t>prisma</w:t>
+      </w:r>
+      <w:proofErr w:type="spellEnd"/>
+      <w:r>
+        <w:rPr>
+          <w:rFonts w:eastAsia="Times New Roman" w:cs="Courier New"/>
+          <w:kern w:val="0"/>
+          <w14:ligatures w14:val="none"/>
+        </w:rPr>
+        <w:t>/</w:t>
+      </w:r>
+    </w:p>
+    <w:p>
+      <w:pPr>
+        <w:pBdr>
+          <w:top w:val="single" w:sz="6" w:space="12" w:color="313131"/>
+          <w:left w:val="single" w:sz="6" w:space="12" w:color="313131"/>
+          <w:bottom w:val="single" w:sz="6" w:space="12" w:color="313131"/>
+          <w:right w:val="single" w:sz="6" w:space="12" w:color="313131"/>
+        </w:pBdr>
+        <w:shd w:val="clear" w:color="auto" w:fill="2B2B2B"/>
+        <w:tabs>
+          <w:tab w:val="left" w:pos="916"/>
+          <w:tab w:val="left" w:pos="1832"/>
+          <w:tab w:val="left" w:pos="2748"/>
+          <w:tab w:val="left" w:pos="3664"/>
+          <w:tab w:val="left" w:pos="4580"/>
+          <w:tab w:val="left" w:pos="5496"/>
+          <w:tab w:val="left" w:pos="6412"/>
+          <w:tab w:val="left" w:pos="7328"/>
+          <w:tab w:val="left" w:pos="8244"/>
+          <w:tab w:val="left" w:pos="9160"/>
+          <w:tab w:val="left" w:pos="10076"/>
+          <w:tab w:val="left" w:pos="10992"/>
+          <w:tab w:val="left" w:pos="11908"/>
+          <w:tab w:val="left" w:pos="12824"/>
+          <w:tab w:val="left" w:pos="13740"/>
+          <w:tab w:val="left" w:pos="14656"/>
+        </w:tabs>
+        <w:spacing w:after="0" w:line="326" w:lineRule="atLeast"/>
+        <w:rPr>
+          <w:rFonts w:eastAsia="Times New Roman" w:cs="Courier New"/>
+          <w:kern w:val="0"/>
+          <w14:ligatures w14:val="none"/>
+        </w:rPr>
+      </w:pPr>
+      <w:r>
+        <w:rPr>
+          <w:rFonts w:eastAsia="Times New Roman" w:cs="Courier New"/>
+          <w:kern w:val="0"/>
+          <w14:ligatures w14:val="none"/>
+        </w:rPr>
+        <w:t xml:space="preserve">│   </w:t>
+      </w:r>
+      <w:r>
+        <w:rPr>
+          <w:rFonts w:ascii="MS Gothic" w:eastAsia="MS Gothic" w:hAnsi="MS Gothic" w:cs="MS Gothic" w:hint="eastAsia"/>
+          <w:kern w:val="0"/>
+          <w14:ligatures w14:val="none"/>
+        </w:rPr>
+        <w:t>├</w:t>
+      </w:r>
+      <w:r>
+        <w:rPr>
+          <w:rFonts w:ascii="Aptos" w:eastAsia="Times New Roman" w:hAnsi="Aptos" w:cs="Aptos"/>
+          <w:kern w:val="0"/>
+          <w14:ligatures w14:val="none"/>
+        </w:rPr>
+        <w:t>──</w:t>
+      </w:r>
+      <w:r>
+        <w:rPr>
+          <w:rFonts w:eastAsia="Times New Roman" w:cs="Courier New"/>
+          <w:kern w:val="0"/>
+          <w14:ligatures w14:val="none"/>
+        </w:rPr>
+        <w:t xml:space="preserve"> </w:t>
+      </w:r>
+      <w:proofErr w:type="spellStart"/>
+      <w:proofErr w:type="gramStart"/>
+      <w:r>
+        <w:rPr>
+          <w:rFonts w:eastAsia="Times New Roman" w:cs="Courier New"/>
+          <w:kern w:val="0"/>
+          <w14:ligatures w14:val="none"/>
+        </w:rPr>
+        <w:t>package.json</w:t>
+      </w:r>
+      <w:proofErr w:type="spellEnd"/>
+      <w:proofErr w:type="gramEnd"/>
+    </w:p>
+    <w:p>
+      <w:pPr>
+        <w:pBdr>
+          <w:top w:val="single" w:sz="6" w:space="12" w:color="313131"/>
+          <w:left w:val="single" w:sz="6" w:space="12" w:color="313131"/>
+          <w:bottom w:val="single" w:sz="6" w:space="12" w:color="313131"/>
+          <w:right w:val="single" w:sz="6" w:space="12" w:color="313131"/>
+        </w:pBdr>
+        <w:shd w:val="clear" w:color="auto" w:fill="2B2B2B"/>
+        <w:tabs>
+          <w:tab w:val="left" w:pos="916"/>
+          <w:tab w:val="left" w:pos="1832"/>
+          <w:tab w:val="left" w:pos="2748"/>
+          <w:tab w:val="left" w:pos="3664"/>
+          <w:tab w:val="left" w:pos="4580"/>
+          <w:tab w:val="left" w:pos="5496"/>
+          <w:tab w:val="left" w:pos="6412"/>
+          <w:tab w:val="left" w:pos="7328"/>
+          <w:tab w:val="left" w:pos="8244"/>
+          <w:tab w:val="left" w:pos="9160"/>
+          <w:tab w:val="left" w:pos="10076"/>
+          <w:tab w:val="left" w:pos="10992"/>
+          <w:tab w:val="left" w:pos="11908"/>
+          <w:tab w:val="left" w:pos="12824"/>
+          <w:tab w:val="left" w:pos="13740"/>
+          <w:tab w:val="left" w:pos="14656"/>
+        </w:tabs>
+        <w:spacing w:after="0" w:line="326" w:lineRule="atLeast"/>
+        <w:rPr>
+          <w:rFonts w:eastAsia="Times New Roman" w:cs="Courier New"/>
+          <w:kern w:val="0"/>
+          <w14:ligatures w14:val="none"/>
+        </w:rPr>
+      </w:pPr>
+      <w:r>
+        <w:rPr>
+          <w:rFonts w:eastAsia="Times New Roman" w:cs="Courier New"/>
+          <w:kern w:val="0"/>
+          <w14:ligatures w14:val="none"/>
+        </w:rPr>
+        <w:lastRenderedPageBreak/>
+        <w:t xml:space="preserve">│   </w:t>
+      </w:r>
+      <w:r>
+        <w:rPr>
+          <w:rFonts w:ascii="MS Gothic" w:eastAsia="MS Gothic" w:hAnsi="MS Gothic" w:cs="MS Gothic" w:hint="eastAsia"/>
+          <w:kern w:val="0"/>
+          <w14:ligatures w14:val="none"/>
+        </w:rPr>
+        <w:t>├</w:t>
+      </w:r>
+      <w:r>
+        <w:rPr>
+          <w:rFonts w:ascii="Aptos" w:eastAsia="Times New Roman" w:hAnsi="Aptos" w:cs="Aptos"/>
+          <w:kern w:val="0"/>
+          <w14:ligatures w14:val="none"/>
+        </w:rPr>
+        <w:t>──</w:t>
+      </w:r>
+      <w:r>
+        <w:rPr>
+          <w:rFonts w:eastAsia="Times New Roman" w:cs="Courier New"/>
+          <w:kern w:val="0"/>
+          <w14:ligatures w14:val="none"/>
+        </w:rPr>
+        <w:t xml:space="preserve"> </w:t>
+      </w:r>
+      <w:proofErr w:type="spellStart"/>
+      <w:proofErr w:type="gramStart"/>
+      <w:r>
+        <w:rPr>
+          <w:rFonts w:eastAsia="Times New Roman" w:cs="Courier New"/>
+          <w:kern w:val="0"/>
+          <w14:ligatures w14:val="none"/>
+        </w:rPr>
+        <w:t>turbo.json</w:t>
+      </w:r>
+      <w:proofErr w:type="spellEnd"/>
+      <w:proofErr w:type="gramEnd"/>
+    </w:p>
+    <w:p>
+      <w:pPr>
+        <w:pBdr>
+          <w:top w:val="single" w:sz="6" w:space="12" w:color="313131"/>
+          <w:left w:val="single" w:sz="6" w:space="12" w:color="313131"/>
+          <w:bottom w:val="single" w:sz="6" w:space="12" w:color="313131"/>
+          <w:right w:val="single" w:sz="6" w:space="12" w:color="313131"/>
+        </w:pBdr>
+        <w:shd w:val="clear" w:color="auto" w:fill="2B2B2B"/>
+        <w:tabs>
+          <w:tab w:val="left" w:pos="916"/>
+          <w:tab w:val="left" w:pos="1832"/>
+          <w:tab w:val="left" w:pos="2748"/>
+          <w:tab w:val="left" w:pos="3664"/>
+          <w:tab w:val="left" w:pos="4580"/>
+          <w:tab w:val="left" w:pos="5496"/>
+          <w:tab w:val="left" w:pos="6412"/>
+          <w:tab w:val="left" w:pos="7328"/>
+          <w:tab w:val="left" w:pos="8244"/>
+          <w:tab w:val="left" w:pos="9160"/>
+          <w:tab w:val="left" w:pos="10076"/>
+          <w:tab w:val="left" w:pos="10992"/>
+          <w:tab w:val="left" w:pos="11908"/>
+          <w:tab w:val="left" w:pos="12824"/>
+          <w:tab w:val="left" w:pos="13740"/>
+          <w:tab w:val="left" w:pos="14656"/>
+        </w:tabs>
+        <w:spacing w:after="0" w:line="326" w:lineRule="atLeast"/>
+        <w:rPr>
+          <w:rFonts w:eastAsia="Times New Roman" w:cs="Courier New"/>
+          <w:kern w:val="0"/>
+          <w14:ligatures w14:val="none"/>
+        </w:rPr>
+      </w:pPr>
+      <w:r>
+        <w:rPr>
+          <w:rFonts w:eastAsia="Times New Roman" w:cs="Courier New"/>
+          <w:kern w:val="0"/>
+          <w14:ligatures w14:val="none"/>
+        </w:rPr>
+        <w:t xml:space="preserve">│   └── </w:t>
+      </w:r>
+      <w:proofErr w:type="spellStart"/>
+      <w:r>
+        <w:rPr>
+          <w:rFonts w:eastAsia="Times New Roman" w:cs="Courier New"/>
+          <w:kern w:val="0"/>
+          <w14:ligatures w14:val="none"/>
+        </w:rPr>
+        <w:t>pnpm-</w:t>
+      </w:r>
+      <w:proofErr w:type="gramStart"/>
+      <w:r>
+        <w:rPr>
+          <w:rFonts w:eastAsia="Times New Roman" w:cs="Courier New"/>
+          <w:kern w:val="0"/>
+          <w14:ligatures w14:val="none"/>
+        </w:rPr>
+        <w:t>workspace.yaml</w:t>
+      </w:r>
+      <w:proofErr w:type="spellEnd"/>
+      <w:proofErr w:type="gramEnd"/>
+    </w:p>
+    <w:p>
+      <w:pPr>
+        <w:spacing w:before="360" w:after="240" w:line="240" w:lineRule="auto"/>
+        <w:outlineLvl w:val="1"/>
+        <w:rPr>
+          <w:rFonts w:eastAsia="Times New Roman" w:cs="Segoe UI"/>
+          <w:b/>
+          <w:bCs/>
+          <w:kern w:val="0"/>
+          <w14:ligatures w14:val="none"/>
+        </w:rPr>
+      </w:pPr>
+      <w:r>
+        <w:rPr>
+          <w:rFonts w:eastAsia="Times New Roman" w:cs="Segoe UI"/>
+          <w:b/>
+          <w:bCs/>
+          <w:kern w:val="0"/>
+          <w14:ligatures w14:val="none"/>
+        </w:rPr>
+        <w:t>Prerequisites</w:t>
+      </w:r>
+    </w:p>
+    <w:p>
+      <w:pPr>
+        <w:numPr>
+          <w:ilvl w:val="0"/>
+          <w:numId w:val="34"/>
+        </w:numPr>
+        <w:spacing w:before="100" w:beforeAutospacing="1" w:after="100" w:afterAutospacing="1" w:line="240" w:lineRule="auto"/>
+        <w:rPr>
+          <w:rFonts w:eastAsia="Times New Roman" w:cs="Segoe UI"/>
+          <w:kern w:val="0"/>
+          <w14:ligatures w14:val="none"/>
+        </w:rPr>
+      </w:pPr>
+      <w:r>
+        <w:rPr>
+          <w:rFonts w:eastAsia="Times New Roman" w:cs="Segoe UI"/>
+          <w:kern w:val="0"/>
+          <w14:ligatures w14:val="none"/>
+        </w:rPr>
+        <w:t>Node.js (v20+)</w:t>
+      </w:r>
+    </w:p>
+    <w:p>
+      <w:pPr>
+        <w:numPr>
+          <w:ilvl w:val="0"/>
+          <w:numId w:val="34"/>
+        </w:numPr>
+        <w:spacing w:before="100" w:beforeAutospacing="1" w:after="100" w:afterAutospacing="1" w:line="240" w:lineRule="auto"/>
+        <w:rPr>
+          <w:rFonts w:eastAsia="Times New Roman" w:cs="Segoe UI"/>
+          <w:kern w:val="0"/>
+          <w14:ligatures w14:val="none"/>
+        </w:rPr>
+      </w:pPr>
+      <w:proofErr w:type="spellStart"/>
+      <w:r>
+        <w:rPr>
+          <w:rFonts w:eastAsia="Times New Roman" w:cs="Segoe UI"/>
+          <w:kern w:val="0"/>
+          <w14:ligatures w14:val="none"/>
+        </w:rPr>
+        <w:t>pnpm</w:t>
+      </w:r>
+      <w:proofErr w:type="spellEnd"/>
+    </w:p>
+    <w:p>
+      <w:pPr>
+        <w:spacing w:after="240" w:line="240" w:lineRule="auto"/>
+        <w:rPr>
+          <w:rFonts w:eastAsia="Times New Roman" w:cs="Segoe UI"/>
+          <w:kern w:val="0"/>
+          <w14:ligatures w14:val="none"/>
+        </w:rPr>
+      </w:pPr>
+      <w:r>
+        <w:rPr>
+          <w:rFonts w:eastAsia="Times New Roman" w:cs="Segoe UI"/>
+          <w:kern w:val="0"/>
+          <w14:ligatures w14:val="none"/>
+        </w:rPr>
+        <w:t xml:space="preserve">Install </w:t>
+      </w:r>
+      <w:proofErr w:type="spellStart"/>
+      <w:r>
+        <w:rPr>
+          <w:rFonts w:eastAsia="Times New Roman" w:cs="Segoe UI"/>
+          <w:kern w:val="0"/>
+          <w14:ligatures w14:val="none"/>
+        </w:rPr>
+        <w:t>pnpm</w:t>
+      </w:r>
+      <w:proofErr w:type="spellEnd"/>
+      <w:r>
+        <w:rPr>
+          <w:rFonts w:eastAsia="Times New Roman" w:cs="Segoe UI"/>
+          <w:kern w:val="0"/>
+          <w14:ligatures w14:val="none"/>
+        </w:rPr>
+        <w:t xml:space="preserve"> if needed:</w:t>
+      </w:r>
+    </w:p>
+    <w:p>
+      <w:pPr>
+        <w:pBdr>
+          <w:top w:val="single" w:sz="6" w:space="12" w:color="313131"/>
+          <w:left w:val="single" w:sz="6" w:space="12" w:color="313131"/>
+          <w:bottom w:val="single" w:sz="6" w:space="12" w:color="313131"/>
+          <w:right w:val="single" w:sz="6" w:space="12" w:color="313131"/>
+        </w:pBdr>
+        <w:shd w:val="clear" w:color="auto" w:fill="2B2B2B"/>
+        <w:tabs>
+          <w:tab w:val="left" w:pos="916"/>
+          <w:tab w:val="left" w:pos="1832"/>
+          <w:tab w:val="left" w:pos="2748"/>
+          <w:tab w:val="left" w:pos="3664"/>
+          <w:tab w:val="left" w:pos="4580"/>
+          <w:tab w:val="left" w:pos="5496"/>
+          <w:tab w:val="left" w:pos="6412"/>
+          <w:tab w:val="left" w:pos="7328"/>
+          <w:tab w:val="left" w:pos="8244"/>
+          <w:tab w:val="left" w:pos="9160"/>
+          <w:tab w:val="left" w:pos="10076"/>
+          <w:tab w:val="left" w:pos="10992"/>
+          <w:tab w:val="left" w:pos="11908"/>
+          <w:tab w:val="left" w:pos="12824"/>
+          <w:tab w:val="left" w:pos="13740"/>
+          <w:tab w:val="left" w:pos="14656"/>
+        </w:tabs>
+        <w:spacing w:after="0" w:line="326" w:lineRule="atLeast"/>
+        <w:rPr>
+          <w:rFonts w:eastAsia="Times New Roman" w:cs="Courier New"/>
+          <w:kern w:val="0"/>
+          <w14:ligatures w14:val="none"/>
+        </w:rPr>
+      </w:pPr>
+      <w:proofErr w:type="spellStart"/>
+      <w:r>
+        <w:rPr>
+          <w:rFonts w:eastAsia="Times New Roman" w:cs="Courier New"/>
+          <w:kern w:val="0"/>
+          <w14:ligatures w14:val="none"/>
+        </w:rPr>
+        <w:t>npm</w:t>
+      </w:r>
+      <w:proofErr w:type="spellEnd"/>
+      <w:r>
+        <w:rPr>
+          <w:rFonts w:eastAsia="Times New Roman" w:cs="Courier New"/>
+          <w:kern w:val="0"/>
+          <w14:ligatures w14:val="none"/>
+        </w:rPr>
+        <w:t xml:space="preserve"> install -g </w:t>
+      </w:r>
+      <w:proofErr w:type="spellStart"/>
+      <w:r>
+        <w:rPr>
+          <w:rFonts w:eastAsia="Times New Roman" w:cs="Courier New"/>
+          <w:kern w:val="0"/>
+          <w14:ligatures w14:val="none"/>
+        </w:rPr>
+        <w:t>pnpm</w:t>
+      </w:r>
+      <w:proofErr w:type="spellEnd"/>
+    </w:p>
+    <w:p>
+      <w:pPr>
+        <w:spacing w:after="240" w:line="240" w:lineRule="auto"/>
+        <w:rPr>
+          <w:rFonts w:eastAsia="Times New Roman" w:cs="Segoe UI"/>
+          <w:kern w:val="0"/>
+          <w14:ligatures w14:val="none"/>
+        </w:rPr>
+      </w:pPr>
+      <w:r>
+        <w:rPr>
+          <w:rFonts w:eastAsia="Times New Roman" w:cs="Segoe UI"/>
+          <w:kern w:val="0"/>
+          <w14:ligatures w14:val="none"/>
+        </w:rPr>
+        <w:t>Verify installations:</w:t>
+      </w:r>
+    </w:p>
+    <w:p>
+      <w:pPr>
+        <w:pBdr>
+          <w:top w:val="single" w:sz="6" w:space="12" w:color="313131"/>
+          <w:left w:val="single" w:sz="6" w:space="12" w:color="313131"/>
+          <w:bottom w:val="single" w:sz="6" w:space="12" w:color="313131"/>
+          <w:right w:val="single" w:sz="6" w:space="12" w:color="313131"/>
+        </w:pBdr>
+        <w:shd w:val="clear" w:color="auto" w:fill="2B2B2B"/>
+        <w:tabs>
+          <w:tab w:val="left" w:pos="916"/>
+          <w:tab w:val="left" w:pos="1832"/>
+          <w:tab w:val="left" w:pos="2748"/>
+          <w:tab w:val="left" w:pos="3664"/>
+          <w:tab w:val="left" w:pos="4580"/>
+          <w:tab w:val="left" w:pos="5496"/>
+          <w:tab w:val="left" w:pos="6412"/>
+          <w:tab w:val="left" w:pos="7328"/>
+          <w:tab w:val="left" w:pos="8244"/>
+          <w:tab w:val="left" w:pos="9160"/>
+          <w:tab w:val="left" w:pos="10076"/>
+          <w:tab w:val="left" w:pos="10992"/>
+          <w:tab w:val="left" w:pos="11908"/>
+          <w:tab w:val="left" w:pos="12824"/>
+          <w:tab w:val="left" w:pos="13740"/>
+          <w:tab w:val="left" w:pos="14656"/>
+        </w:tabs>
+        <w:spacing w:after="0" w:line="326" w:lineRule="atLeast"/>
+        <w:rPr>
+          <w:rFonts w:eastAsia="Times New Roman" w:cs="Courier New"/>
+          <w:kern w:val="0"/>
+          <w14:ligatures w14:val="none"/>
+        </w:rPr>
+      </w:pPr>
+      <w:r>
+        <w:rPr>
+          <w:rFonts w:eastAsia="Times New Roman" w:cs="Courier New"/>
+          <w:kern w:val="0"/>
+          <w14:ligatures w14:val="none"/>
+        </w:rPr>
+        <w:t>node -v</w:t>
+      </w:r>
+    </w:p>
+    <w:p>
+      <w:pPr>
+        <w:pBdr>
+          <w:top w:val="single" w:sz="6" w:space="12" w:color="313131"/>
+          <w:left w:val="single" w:sz="6" w:space="12" w:color="313131"/>
+          <w:bottom w:val="single" w:sz="6" w:space="12" w:color="313131"/>
+          <w:right w:val="single" w:sz="6" w:space="12" w:color="313131"/>
+        </w:pBdr>
+        <w:shd w:val="clear" w:color="auto" w:fill="2B2B2B"/>
+        <w:tabs>
+          <w:tab w:val="left" w:pos="916"/>
+          <w:tab w:val="left" w:pos="1832"/>
+          <w:tab w:val="left" w:pos="2748"/>
+          <w:tab w:val="left" w:pos="3664"/>
+          <w:tab w:val="left" w:pos="4580"/>
+          <w:tab w:val="left" w:pos="5496"/>
+          <w:tab w:val="left" w:pos="6412"/>
+          <w:tab w:val="left" w:pos="7328"/>
+          <w:tab w:val="left" w:pos="8244"/>
+          <w:tab w:val="left" w:pos="9160"/>
+          <w:tab w:val="left" w:pos="10076"/>
+          <w:tab w:val="left" w:pos="10992"/>
+          <w:tab w:val="left" w:pos="11908"/>
+          <w:tab w:val="left" w:pos="12824"/>
+          <w:tab w:val="left" w:pos="13740"/>
+          <w:tab w:val="left" w:pos="14656"/>
+        </w:tabs>
+        <w:spacing w:after="0" w:line="326" w:lineRule="atLeast"/>
+        <w:rPr>
+          <w:rFonts w:eastAsia="Times New Roman" w:cs="Courier New"/>
+          <w:kern w:val="0"/>
+          <w14:ligatures w14:val="none"/>
+        </w:rPr>
+      </w:pPr>
+      <w:proofErr w:type="spellStart"/>
+      <w:r>
+        <w:rPr>
+          <w:rFonts w:eastAsia="Times New Roman" w:cs="Courier New"/>
+          <w:kern w:val="0"/>
+          <w14:ligatures w14:val="none"/>
+        </w:rPr>
+        <w:t>pnpm</w:t>
+      </w:r>
+      <w:proofErr w:type="spellEnd"/>
+      <w:r>
+        <w:rPr>
+          <w:rFonts w:eastAsia="Times New Roman" w:cs="Courier New"/>
+          <w:kern w:val="0"/>
+          <w14:ligatures w14:val="none"/>
+        </w:rPr>
+        <w:t xml:space="preserve"> -v</w:t>
+      </w:r>
+    </w:p>
+    <w:p>
+      <w:pPr>
+        <w:spacing w:before="360" w:after="240" w:line="240" w:lineRule="auto"/>
+        <w:outlineLvl w:val="1"/>
+        <w:rPr>
+          <w:rFonts w:eastAsia="Times New Roman" w:cs="Segoe UI"/>
+          <w:b/>
+          <w:bCs/>
+          <w:kern w:val="0"/>
+          <w14:ligatures w14:val="none"/>
+        </w:rPr>
+      </w:pPr>
+      <w:r>
+        <w:rPr>
+          <w:rFonts w:eastAsia="Times New Roman" w:cs="Segoe UI"/>
+          <w:b/>
+          <w:bCs/>
+          <w:kern w:val="0"/>
+          <w14:ligatures w14:val="none"/>
+        </w:rPr>
+        <w:t>Installation &amp; Setup</w:t>
+      </w:r>
+    </w:p>
+    <w:p>
+      <w:pPr>
+        <w:spacing w:before="360" w:after="240" w:line="240" w:lineRule="auto"/>
+        <w:outlineLvl w:val="2"/>
+        <w:rPr>
+          <w:rFonts w:eastAsia="Times New Roman" w:cs="Segoe UI"/>
+          <w:b/>
+          <w:bCs/>
+          <w:kern w:val="0"/>
+          <w14:ligatures w14:val="none"/>
+        </w:rPr>
+      </w:pPr>
+      <w:r>
+        <w:rPr>
+          <w:rFonts w:eastAsia="Times New Roman" w:cs="Segoe UI"/>
+          <w:b/>
+          <w:bCs/>
+          <w:kern w:val="0"/>
+          <w14:ligatures w14:val="none"/>
+        </w:rPr>
+        <w:t>1. Clone the Repository</w:t>
+      </w:r>
+    </w:p>
+    <w:p>
+      <w:pPr>
+        <w:pBdr>
+          <w:top w:val="single" w:sz="6" w:space="12" w:color="313131"/>
+          <w:left w:val="single" w:sz="6" w:space="12" w:color="313131"/>
+          <w:bottom w:val="single" w:sz="6" w:space="12" w:color="313131"/>
+          <w:right w:val="single" w:sz="6" w:space="12" w:color="313131"/>
+        </w:pBdr>
+        <w:shd w:val="clear" w:color="auto" w:fill="2B2B2B"/>
+        <w:tabs>
+          <w:tab w:val="left" w:pos="916"/>
+          <w:tab w:val="left" w:pos="1832"/>
+          <w:tab w:val="left" w:pos="2748"/>
+          <w:tab w:val="left" w:pos="3664"/>
+          <w:tab w:val="left" w:pos="4580"/>
+          <w:tab w:val="left" w:pos="5496"/>
+          <w:tab w:val="left" w:pos="6412"/>
+          <w:tab w:val="left" w:pos="7328"/>
+          <w:tab w:val="left" w:pos="8244"/>
+          <w:tab w:val="left" w:pos="9160"/>
+          <w:tab w:val="left" w:pos="10076"/>
+          <w:tab w:val="left" w:pos="10992"/>
+          <w:tab w:val="left" w:pos="11908"/>
+          <w:tab w:val="left" w:pos="12824"/>
+          <w:tab w:val="left" w:pos="13740"/>
+          <w:tab w:val="left" w:pos="14656"/>
+        </w:tabs>
+        <w:spacing w:after="0" w:line="326" w:lineRule="atLeast"/>
+        <w:rPr>
+          <w:rFonts w:eastAsia="Times New Roman" w:cs="Courier New"/>
+          <w:kern w:val="0"/>
+          <w14:ligatures w14:val="none"/>
+        </w:rPr>
+      </w:pPr>
+      <w:r>
+        <w:rPr>
+          <w:rFonts w:eastAsia="Times New Roman" w:cs="Courier New"/>
+          <w:kern w:val="0"/>
+          <w14:ligatures w14:val="none"/>
+        </w:rPr>
+        <w:t>git clone https://github.com/kylercressall/cs4400-findapump.git</w:t>
+      </w:r>
+    </w:p>
+    <w:p>
+      <w:pPr>
+        <w:pBdr>
+          <w:top w:val="single" w:sz="6" w:space="12" w:color="313131"/>
+          <w:left w:val="single" w:sz="6" w:space="12" w:color="313131"/>
+          <w:bottom w:val="single" w:sz="6" w:space="12" w:color="313131"/>
+          <w:right w:val="single" w:sz="6" w:space="12" w:color="313131"/>
+        </w:pBdr>
+        <w:shd w:val="clear" w:color="auto" w:fill="2B2B2B"/>
+        <w:tabs>
+          <w:tab w:val="left" w:pos="916"/>
+          <w:tab w:val="left" w:pos="1832"/>
+          <w:tab w:val="left" w:pos="2748"/>
+          <w:tab w:val="left" w:pos="3664"/>
+          <w:tab w:val="left" w:pos="4580"/>
+          <w:tab w:val="left" w:pos="5496"/>
+          <w:tab w:val="left" w:pos="6412"/>
+          <w:tab w:val="left" w:pos="7328"/>
+          <w:tab w:val="left" w:pos="8244"/>
+          <w:tab w:val="left" w:pos="9160"/>
+          <w:tab w:val="left" w:pos="10076"/>
+          <w:tab w:val="left" w:pos="10992"/>
+          <w:tab w:val="left" w:pos="11908"/>
+          <w:tab w:val="left" w:pos="12824"/>
+          <w:tab w:val="left" w:pos="13740"/>
+          <w:tab w:val="left" w:pos="14656"/>
+        </w:tabs>
+        <w:spacing w:after="0" w:line="326" w:lineRule="atLeast"/>
+        <w:rPr>
+          <w:rFonts w:eastAsia="Times New Roman" w:cs="Courier New"/>
+          <w:kern w:val="0"/>
+          <w14:ligatures w14:val="none"/>
+        </w:rPr>
+      </w:pPr>
+      <w:r>
+        <w:rPr>
+          <w:rFonts w:eastAsia="Times New Roman" w:cs="Courier New"/>
+          <w:kern w:val="0"/>
+          <w14:ligatures w14:val="none"/>
+        </w:rPr>
+        <w:t>cd cs4400-findapump/find-a-pump-code</w:t>
+      </w:r>
+    </w:p>
+    <w:p>
+      <w:pPr>
+        <w:spacing w:before="360" w:after="240" w:line="240" w:lineRule="auto"/>
+        <w:outlineLvl w:val="2"/>
+        <w:rPr>
+          <w:rFonts w:eastAsia="Times New Roman" w:cs="Segoe UI"/>
+          <w:b/>
+          <w:bCs/>
+          <w:kern w:val="0"/>
+          <w14:ligatures w14:val="none"/>
+        </w:rPr>
+      </w:pPr>
+      <w:r>
+        <w:rPr>
+          <w:rFonts w:eastAsia="Times New Roman" w:cs="Segoe UI"/>
+          <w:b/>
+          <w:bCs/>
+          <w:kern w:val="0"/>
+          <w14:ligatures w14:val="none"/>
+        </w:rPr>
+        <w:t>2. Install Dependencies</w:t>
+      </w:r>
+    </w:p>
+    <w:p>
+      <w:pPr>
+        <w:pBdr>
+          <w:top w:val="single" w:sz="6" w:space="12" w:color="313131"/>
+          <w:left w:val="single" w:sz="6" w:space="12" w:color="313131"/>
+          <w:bottom w:val="single" w:sz="6" w:space="12" w:color="313131"/>
+          <w:right w:val="single" w:sz="6" w:space="12" w:color="313131"/>
+        </w:pBdr>
+        <w:shd w:val="clear" w:color="auto" w:fill="2B2B2B"/>
+        <w:tabs>
+          <w:tab w:val="left" w:pos="916"/>
+          <w:tab w:val="left" w:pos="1832"/>
+          <w:tab w:val="left" w:pos="2748"/>
+          <w:tab w:val="left" w:pos="3664"/>
+          <w:tab w:val="left" w:pos="4580"/>
+          <w:tab w:val="left" w:pos="5496"/>
+          <w:tab w:val="left" w:pos="6412"/>
+          <w:tab w:val="left" w:pos="7328"/>
+          <w:tab w:val="left" w:pos="8244"/>
+          <w:tab w:val="left" w:pos="9160"/>
+          <w:tab w:val="left" w:pos="10076"/>
+          <w:tab w:val="left" w:pos="10992"/>
+          <w:tab w:val="left" w:pos="11908"/>
+          <w:tab w:val="left" w:pos="12824"/>
+          <w:tab w:val="left" w:pos="13740"/>
+          <w:tab w:val="left" w:pos="14656"/>
+        </w:tabs>
+        <w:spacing w:after="0" w:line="326" w:lineRule="atLeast"/>
+        <w:rPr>
+          <w:rFonts w:eastAsia="Times New Roman" w:cs="Courier New"/>
+          <w:kern w:val="0"/>
+          <w14:ligatures w14:val="none"/>
+        </w:rPr>
+      </w:pPr>
+      <w:proofErr w:type="spellStart"/>
+      <w:r>
+        <w:rPr>
+          <w:rFonts w:eastAsia="Times New Roman" w:cs="Courier New"/>
+          <w:kern w:val="0"/>
+          <w14:ligatures w14:val="none"/>
+        </w:rPr>
+        <w:t>pnpm</w:t>
+      </w:r>
+      <w:proofErr w:type="spellEnd"/>
+      <w:r>
+        <w:rPr>
+          <w:rFonts w:eastAsia="Times New Roman" w:cs="Courier New"/>
+          <w:kern w:val="0"/>
+          <w14:ligatures w14:val="none"/>
+        </w:rPr>
+        <w:t xml:space="preserve"> install</w:t>
+      </w:r>
+    </w:p>
+    <w:p>
+      <w:pPr>
+        <w:spacing w:before="360" w:after="240" w:line="240" w:lineRule="auto"/>
+        <w:outlineLvl w:val="2"/>
+        <w:rPr>
+          <w:rFonts w:eastAsia="Times New Roman" w:cs="Segoe UI"/>
+          <w:b/>
+          <w:bCs/>
+          <w:kern w:val="0"/>
+          <w14:ligatures w14:val="none"/>
+        </w:rPr>
+      </w:pPr>
+      <w:r>
+        <w:rPr>
+          <w:rFonts w:eastAsia="Times New Roman" w:cs="Segoe UI"/>
+          <w:b/>
+          <w:bCs/>
+          <w:kern w:val="0"/>
+          <w14:ligatures w14:val="none"/>
+        </w:rPr>
+        <w:t>3. Set Up Environment Variables</w:t>
+      </w:r>
+    </w:p>
+    <w:p>
+      <w:pPr>
+        <w:spacing w:after="240" w:line="240" w:lineRule="auto"/>
+        <w:rPr>
+          <w:rFonts w:eastAsia="Times New Roman" w:cs="Segoe UI"/>
+          <w:kern w:val="0"/>
+          <w14:ligatures w14:val="none"/>
+        </w:rPr>
+      </w:pPr>
+      <w:r>
+        <w:rPr>
+          <w:rFonts w:eastAsia="Times New Roman" w:cs="Segoe UI"/>
+          <w:kern w:val="0"/>
+          <w14:ligatures w14:val="none"/>
+        </w:rPr>
+        <w:t>Create the following files:</w:t>
+      </w:r>
+    </w:p>
+    <w:p>
+      <w:pPr>
+        <w:spacing w:after="240" w:line="240" w:lineRule="auto"/>
+        <w:rPr>
+          <w:rFonts w:eastAsia="Times New Roman" w:cs="Segoe UI"/>
+          <w:kern w:val="0"/>
+          <w14:ligatures w14:val="none"/>
+        </w:rPr>
+      </w:pPr>
+      <w:r>
+        <w:rPr>
+          <w:rFonts w:eastAsia="Times New Roman" w:cs="Segoe UI"/>
+          <w:b/>
+          <w:bCs/>
+          <w:kern w:val="0"/>
+          <w14:ligatures w14:val="none"/>
+        </w:rPr>
+        <w:t>apps/backend</w:t>
+      </w:r>
+      <w:proofErr w:type="gramStart"/>
+      <w:r>
+        <w:rPr>
+          <w:rFonts w:eastAsia="Times New Roman" w:cs="Segoe UI"/>
+          <w:b/>
+          <w:bCs/>
+          <w:kern w:val="0"/>
+          <w14:ligatures w14:val="none"/>
+        </w:rPr>
+        <w:t>/.env</w:t>
+      </w:r>
+      <w:proofErr w:type="gramEnd"/>
+    </w:p>
+    <w:p>
+      <w:pPr>
+        <w:pBdr>
+          <w:top w:val="single" w:sz="6" w:space="12" w:color="313131"/>
+          <w:left w:val="single" w:sz="6" w:space="12" w:color="313131"/>
+          <w:bottom w:val="single" w:sz="6" w:space="12" w:color="313131"/>
+          <w:right w:val="single" w:sz="6" w:space="12" w:color="313131"/>
+        </w:pBdr>
+        <w:shd w:val="clear" w:color="auto" w:fill="2B2B2B"/>
+        <w:tabs>
+          <w:tab w:val="left" w:pos="916"/>
+          <w:tab w:val="left" w:pos="1832"/>
+          <w:tab w:val="left" w:pos="2748"/>
+          <w:tab w:val="left" w:pos="3664"/>
+          <w:tab w:val="left" w:pos="4580"/>
+          <w:tab w:val="left" w:pos="5496"/>
+          <w:tab w:val="left" w:pos="6412"/>
+          <w:tab w:val="left" w:pos="7328"/>
+          <w:tab w:val="left" w:pos="8244"/>
+          <w:tab w:val="left" w:pos="9160"/>
+          <w:tab w:val="left" w:pos="10076"/>
+          <w:tab w:val="left" w:pos="10992"/>
+          <w:tab w:val="left" w:pos="11908"/>
+          <w:tab w:val="left" w:pos="12824"/>
+          <w:tab w:val="left" w:pos="13740"/>
+          <w:tab w:val="left" w:pos="14656"/>
+        </w:tabs>
+        <w:spacing w:after="0" w:line="326" w:lineRule="atLeast"/>
+        <w:rPr>
+          <w:rFonts w:eastAsia="Times New Roman" w:cs="Courier New"/>
+          <w:kern w:val="0"/>
+          <w14:ligatures w14:val="none"/>
+        </w:rPr>
+      </w:pPr>
+      <w:r>
+        <w:rPr>
+          <w:rFonts w:eastAsia="Times New Roman" w:cs="Courier New"/>
+          <w:kern w:val="0"/>
+          <w14:ligatures w14:val="none"/>
+        </w:rPr>
+        <w:t>DATABASE_URL="file</w:t>
+      </w:r>
+      <w:proofErr w:type="gramStart"/>
+      <w:r>
+        <w:rPr>
+          <w:rFonts w:eastAsia="Times New Roman" w:cs="Courier New"/>
+          <w:kern w:val="0"/>
+          <w14:ligatures w14:val="none"/>
+        </w:rPr>
+        <w:t>:./</w:t>
+      </w:r>
+      <w:proofErr w:type="spellStart"/>
+      <w:proofErr w:type="gramEnd"/>
+      <w:r>
+        <w:rPr>
+          <w:rFonts w:eastAsia="Times New Roman" w:cs="Courier New"/>
+          <w:kern w:val="0"/>
+          <w14:ligatures w14:val="none"/>
+        </w:rPr>
+        <w:t>dev.db</w:t>
+      </w:r>
+      <w:proofErr w:type="spellEnd"/>
+      <w:r>
+        <w:rPr>
+          <w:rFonts w:eastAsia="Times New Roman" w:cs="Courier New"/>
+          <w:kern w:val="0"/>
+          <w14:ligatures w14:val="none"/>
+        </w:rPr>
+        <w:t>"</w:t>
+      </w:r>
+    </w:p>
+    <w:p>
+      <w:pPr>
+        <w:pBdr>
+          <w:top w:val="single" w:sz="6" w:space="12" w:color="313131"/>
+          <w:left w:val="single" w:sz="6" w:space="12" w:color="313131"/>
+          <w:bottom w:val="single" w:sz="6" w:space="12" w:color="313131"/>
+          <w:right w:val="single" w:sz="6" w:space="12" w:color="313131"/>
+        </w:pBdr>
+        <w:shd w:val="clear" w:color="auto" w:fill="2B2B2B"/>
+        <w:tabs>
+          <w:tab w:val="left" w:pos="916"/>
+          <w:tab w:val="left" w:pos="1832"/>
+          <w:tab w:val="left" w:pos="2748"/>
+          <w:tab w:val="left" w:pos="3664"/>
+          <w:tab w:val="left" w:pos="4580"/>
+          <w:tab w:val="left" w:pos="5496"/>
+          <w:tab w:val="left" w:pos="6412"/>
+          <w:tab w:val="left" w:pos="7328"/>
+          <w:tab w:val="left" w:pos="8244"/>
+          <w:tab w:val="left" w:pos="9160"/>
+          <w:tab w:val="left" w:pos="10076"/>
+          <w:tab w:val="left" w:pos="10992"/>
+          <w:tab w:val="left" w:pos="11908"/>
+          <w:tab w:val="left" w:pos="12824"/>
+          <w:tab w:val="left" w:pos="13740"/>
+          <w:tab w:val="left" w:pos="14656"/>
+        </w:tabs>
+        <w:spacing w:after="0" w:line="326" w:lineRule="atLeast"/>
+        <w:rPr>
+          <w:rFonts w:eastAsia="Times New Roman" w:cs="Courier New"/>
+          <w:kern w:val="0"/>
+          <w14:ligatures w14:val="none"/>
+        </w:rPr>
+      </w:pPr>
+      <w:r>
+        <w:rPr>
+          <w:rFonts w:eastAsia="Times New Roman" w:cs="Courier New"/>
+          <w:kern w:val="0"/>
+          <w14:ligatures w14:val="none"/>
+        </w:rPr>
+        <w:lastRenderedPageBreak/>
+        <w:t>PORT=4000</w:t>
+      </w:r>
+    </w:p>
+    <w:p>
+      <w:pPr>
+        <w:spacing w:after="240" w:line="240" w:lineRule="auto"/>
+        <w:rPr>
+          <w:rFonts w:eastAsia="Times New Roman" w:cs="Segoe UI"/>
+          <w:kern w:val="0"/>
+          <w14:ligatures w14:val="none"/>
+        </w:rPr>
+      </w:pPr>
+      <w:r>
+        <w:rPr>
+          <w:rFonts w:eastAsia="Times New Roman" w:cs="Segoe UI"/>
+          <w:b/>
+          <w:bCs/>
+          <w:kern w:val="0"/>
+          <w14:ligatures w14:val="none"/>
+        </w:rPr>
+        <w:t>apps/frontend</w:t>
+      </w:r>
+      <w:proofErr w:type="gramStart"/>
+      <w:r>
+        <w:rPr>
+          <w:rFonts w:eastAsia="Times New Roman" w:cs="Segoe UI"/>
+          <w:b/>
+          <w:bCs/>
+          <w:kern w:val="0"/>
+          <w14:ligatures w14:val="none"/>
+        </w:rPr>
+        <w:t>/.</w:t>
+      </w:r>
+      <w:proofErr w:type="spellStart"/>
+      <w:r>
+        <w:rPr>
+          <w:rFonts w:eastAsia="Times New Roman" w:cs="Segoe UI"/>
+          <w:b/>
+          <w:bCs/>
+          <w:kern w:val="0"/>
+          <w14:ligatures w14:val="none"/>
+        </w:rPr>
+        <w:t>env</w:t>
+      </w:r>
+      <w:proofErr w:type="gramEnd"/>
+      <w:r>
+        <w:rPr>
+          <w:rFonts w:eastAsia="Times New Roman" w:cs="Segoe UI"/>
+          <w:b/>
+          <w:bCs/>
+          <w:kern w:val="0"/>
+          <w14:ligatures w14:val="none"/>
+        </w:rPr>
+        <w:t>.local</w:t>
+      </w:r>
+      <w:proofErr w:type="spellEnd"/>
+    </w:p>
+    <w:p>
+      <w:pPr>
+        <w:pBdr>
+          <w:top w:val="single" w:sz="6" w:space="12" w:color="313131"/>
+          <w:left w:val="single" w:sz="6" w:space="12" w:color="313131"/>
+          <w:bottom w:val="single" w:sz="6" w:space="12" w:color="313131"/>
+          <w:right w:val="single" w:sz="6" w:space="12" w:color="313131"/>
+        </w:pBdr>
+        <w:shd w:val="clear" w:color="auto" w:fill="2B2B2B"/>
+        <w:tabs>
+          <w:tab w:val="left" w:pos="916"/>
+          <w:tab w:val="left" w:pos="1832"/>
+          <w:tab w:val="left" w:pos="2748"/>
+          <w:tab w:val="left" w:pos="3664"/>
+          <w:tab w:val="left" w:pos="4580"/>
+          <w:tab w:val="left" w:pos="5496"/>
+          <w:tab w:val="left" w:pos="6412"/>
+          <w:tab w:val="left" w:pos="7328"/>
+          <w:tab w:val="left" w:pos="8244"/>
+          <w:tab w:val="left" w:pos="9160"/>
+          <w:tab w:val="left" w:pos="10076"/>
+          <w:tab w:val="left" w:pos="10992"/>
+          <w:tab w:val="left" w:pos="11908"/>
+          <w:tab w:val="left" w:pos="12824"/>
+          <w:tab w:val="left" w:pos="13740"/>
+          <w:tab w:val="left" w:pos="14656"/>
+        </w:tabs>
+        <w:spacing w:after="0" w:line="326" w:lineRule="atLeast"/>
+        <w:rPr>
+          <w:rFonts w:eastAsia="Times New Roman" w:cs="Courier New"/>
+          <w:kern w:val="0"/>
+          <w14:ligatures w14:val="none"/>
+        </w:rPr>
+      </w:pPr>
+      <w:r>
+        <w:rPr>
+          <w:rFonts w:eastAsia="Times New Roman" w:cs="Courier New"/>
+          <w:kern w:val="0"/>
+          <w14:ligatures w14:val="none"/>
+        </w:rPr>
+        <w:t>NEXT_PUBLIC_GOOGLE_MAPS_API_KEY=</w:t>
+      </w:r>
+      <w:proofErr w:type="spellStart"/>
+      <w:r>
+        <w:rPr>
+          <w:rFonts w:eastAsia="Times New Roman" w:cs="Courier New"/>
+          <w:kern w:val="0"/>
+          <w14:ligatures w14:val="none"/>
+        </w:rPr>
+        <w:t>your_google_maps_api_key_here</w:t>
+      </w:r>
+      <w:proofErr w:type="spellEnd"/>
+    </w:p>
+    <w:p>
+      <w:pPr>
+        <w:spacing w:after="240" w:line="240" w:lineRule="auto"/>
+        <w:rPr>
+          <w:rFonts w:eastAsia="Times New Roman" w:cs="Segoe UI"/>
+          <w:kern w:val="0"/>
+          <w14:ligatures w14:val="none"/>
+        </w:rPr>
+      </w:pPr>
+      <w:r>
+        <w:rPr>
+          <w:rFonts w:eastAsia="Times New Roman" w:cs="Segoe UI"/>
+          <w:kern w:val="0"/>
+          <w14:ligatures w14:val="none"/>
+        </w:rPr>
+        <w:t xml:space="preserve">Note: A valid Google Maps JavaScript API key is required for the map to </w:t>
+      </w:r>
+      <w:proofErr w:type="gramStart"/>
+      <w:r>
+        <w:rPr>
+          <w:rFonts w:eastAsia="Times New Roman" w:cs="Segoe UI"/>
+          <w:kern w:val="0"/>
+          <w14:ligatures w14:val="none"/>
+        </w:rPr>
+        <w:t>render</w:t>
+      </w:r>
+      <w:proofErr w:type="gramEnd"/>
+      <w:r>
+        <w:rPr>
+          <w:rFonts w:eastAsia="Times New Roman" w:cs="Segoe UI"/>
+          <w:kern w:val="0"/>
+          <w14:ligatures w14:val="none"/>
+        </w:rPr>
+        <w:t xml:space="preserve"> properly.</w:t>
+      </w:r>
+    </w:p>
+    <w:p>
+      <w:pPr>
+        <w:spacing w:before="360" w:after="240" w:line="240" w:lineRule="auto"/>
+        <w:outlineLvl w:val="2"/>
+        <w:rPr>
+          <w:rFonts w:eastAsia="Times New Roman" w:cs="Segoe UI"/>
+          <w:b/>
+          <w:bCs/>
+          <w:kern w:val="0"/>
+          <w14:ligatures w14:val="none"/>
+        </w:rPr>
+      </w:pPr>
+      <w:r>
+        <w:rPr>
+          <w:rFonts w:eastAsia="Times New Roman" w:cs="Segoe UI"/>
+          <w:b/>
+          <w:bCs/>
+          <w:kern w:val="0"/>
+          <w14:ligatures w14:val="none"/>
+        </w:rPr>
+        <w:t>4. Initialize Database (First Time Only)</w:t>
+      </w:r>
+    </w:p>
+    <w:p>
+      <w:pPr>
+        <w:pBdr>
+          <w:top w:val="single" w:sz="6" w:space="12" w:color="313131"/>
+          <w:left w:val="single" w:sz="6" w:space="12" w:color="313131"/>
+          <w:bottom w:val="single" w:sz="6" w:space="12" w:color="313131"/>
+          <w:right w:val="single" w:sz="6" w:space="12" w:color="313131"/>
+        </w:pBdr>
+        <w:shd w:val="clear" w:color="auto" w:fill="2B2B2B"/>
+        <w:tabs>
+          <w:tab w:val="left" w:pos="916"/>
+          <w:tab w:val="left" w:pos="1832"/>
+          <w:tab w:val="left" w:pos="2748"/>
+          <w:tab w:val="left" w:pos="3664"/>
+          <w:tab w:val="left" w:pos="4580"/>
+          <w:tab w:val="left" w:pos="5496"/>
+          <w:tab w:val="left" w:pos="6412"/>
+          <w:tab w:val="left" w:pos="7328"/>
+          <w:tab w:val="left" w:pos="8244"/>
+          <w:tab w:val="left" w:pos="9160"/>
+          <w:tab w:val="left" w:pos="10076"/>
+          <w:tab w:val="left" w:pos="10992"/>
+          <w:tab w:val="left" w:pos="11908"/>
+          <w:tab w:val="left" w:pos="12824"/>
+          <w:tab w:val="left" w:pos="13740"/>
+          <w:tab w:val="left" w:pos="14656"/>
+        </w:tabs>
+        <w:spacing w:after="0" w:line="326" w:lineRule="atLeast"/>
+        <w:rPr>
+          <w:rFonts w:eastAsia="Times New Roman" w:cs="Courier New"/>
+          <w:kern w:val="0"/>
+          <w14:ligatures w14:val="none"/>
+        </w:rPr>
+      </w:pPr>
+      <w:r>
+        <w:rPr>
+          <w:rFonts w:eastAsia="Times New Roman" w:cs="Courier New"/>
+          <w:kern w:val="0"/>
+          <w14:ligatures w14:val="none"/>
+        </w:rPr>
+        <w:t>cd apps/backend</w:t>
+      </w:r>
+    </w:p>
+    <w:p>
+      <w:pPr>
+        <w:pBdr>
+          <w:top w:val="single" w:sz="6" w:space="12" w:color="313131"/>
+          <w:left w:val="single" w:sz="6" w:space="12" w:color="313131"/>
+          <w:bottom w:val="single" w:sz="6" w:space="12" w:color="313131"/>
+          <w:right w:val="single" w:sz="6" w:space="12" w:color="313131"/>
+        </w:pBdr>
+        <w:shd w:val="clear" w:color="auto" w:fill="2B2B2B"/>
+        <w:tabs>
+          <w:tab w:val="left" w:pos="916"/>
+          <w:tab w:val="left" w:pos="1832"/>
+          <w:tab w:val="left" w:pos="2748"/>
+          <w:tab w:val="left" w:pos="3664"/>
+          <w:tab w:val="left" w:pos="4580"/>
+          <w:tab w:val="left" w:pos="5496"/>
+          <w:tab w:val="left" w:pos="6412"/>
+          <w:tab w:val="left" w:pos="7328"/>
+          <w:tab w:val="left" w:pos="8244"/>
+          <w:tab w:val="left" w:pos="9160"/>
+          <w:tab w:val="left" w:pos="10076"/>
+          <w:tab w:val="left" w:pos="10992"/>
+          <w:tab w:val="left" w:pos="11908"/>
+          <w:tab w:val="left" w:pos="12824"/>
+          <w:tab w:val="left" w:pos="13740"/>
+          <w:tab w:val="left" w:pos="14656"/>
+        </w:tabs>
+        <w:spacing w:after="0" w:line="326" w:lineRule="atLeast"/>
+        <w:rPr>
+          <w:rFonts w:eastAsia="Times New Roman" w:cs="Courier New"/>
+          <w:kern w:val="0"/>
+          <w14:ligatures w14:val="none"/>
+        </w:rPr>
+      </w:pPr>
+      <w:proofErr w:type="spellStart"/>
+      <w:r>
+        <w:rPr>
+          <w:rFonts w:eastAsia="Times New Roman" w:cs="Courier New"/>
+          <w:kern w:val="0"/>
+          <w14:ligatures w14:val="none"/>
+        </w:rPr>
+        <w:t>pnpm</w:t>
+      </w:r>
+      <w:proofErr w:type="spellEnd"/>
+      <w:r>
+        <w:rPr>
+          <w:rFonts w:eastAsia="Times New Roman" w:cs="Courier New"/>
+          <w:kern w:val="0"/>
+          <w14:ligatures w14:val="none"/>
+        </w:rPr>
+        <w:t xml:space="preserve"> </w:t>
+      </w:r>
+      <w:proofErr w:type="spellStart"/>
+      <w:r>
+        <w:rPr>
+          <w:rFonts w:eastAsia="Times New Roman" w:cs="Courier New"/>
+          <w:kern w:val="0"/>
+          <w14:ligatures w14:val="none"/>
+        </w:rPr>
+        <w:t>prisma</w:t>
+      </w:r>
+      <w:proofErr w:type="spellEnd"/>
+      <w:r>
+        <w:rPr>
+          <w:rFonts w:eastAsia="Times New Roman" w:cs="Courier New"/>
+          <w:kern w:val="0"/>
+          <w14:ligatures w14:val="none"/>
+        </w:rPr>
+        <w:t xml:space="preserve"> generate</w:t>
+      </w:r>
+    </w:p>
+    <w:p>
+      <w:pPr>
+        <w:pBdr>
+          <w:top w:val="single" w:sz="6" w:space="12" w:color="313131"/>
+          <w:left w:val="single" w:sz="6" w:space="12" w:color="313131"/>
+          <w:bottom w:val="single" w:sz="6" w:space="12" w:color="313131"/>
+          <w:right w:val="single" w:sz="6" w:space="12" w:color="313131"/>
+        </w:pBdr>
+        <w:shd w:val="clear" w:color="auto" w:fill="2B2B2B"/>
+        <w:tabs>
+          <w:tab w:val="left" w:pos="916"/>
+          <w:tab w:val="left" w:pos="1832"/>
+          <w:tab w:val="left" w:pos="2748"/>
+          <w:tab w:val="left" w:pos="3664"/>
+          <w:tab w:val="left" w:pos="4580"/>
+          <w:tab w:val="left" w:pos="5496"/>
+          <w:tab w:val="left" w:pos="6412"/>
+          <w:tab w:val="left" w:pos="7328"/>
+          <w:tab w:val="left" w:pos="8244"/>
+          <w:tab w:val="left" w:pos="9160"/>
+          <w:tab w:val="left" w:pos="10076"/>
+          <w:tab w:val="left" w:pos="10992"/>
+          <w:tab w:val="left" w:pos="11908"/>
+          <w:tab w:val="left" w:pos="12824"/>
+          <w:tab w:val="left" w:pos="13740"/>
+          <w:tab w:val="left" w:pos="14656"/>
+        </w:tabs>
+        <w:spacing w:after="0" w:line="326" w:lineRule="atLeast"/>
+        <w:rPr>
+          <w:rFonts w:eastAsia="Times New Roman" w:cs="Courier New"/>
+          <w:kern w:val="0"/>
+          <w14:ligatures w14:val="none"/>
+        </w:rPr>
+      </w:pPr>
+      <w:proofErr w:type="spellStart"/>
+      <w:r>
+        <w:rPr>
+          <w:rFonts w:eastAsia="Times New Roman" w:cs="Courier New"/>
+          <w:kern w:val="0"/>
+          <w14:ligatures w14:val="none"/>
+        </w:rPr>
+        <w:t>pnpm</w:t>
+      </w:r>
+      <w:proofErr w:type="spellEnd"/>
+      <w:r>
+        <w:rPr>
+          <w:rFonts w:eastAsia="Times New Roman" w:cs="Courier New"/>
+          <w:kern w:val="0"/>
+          <w14:ligatures w14:val="none"/>
+        </w:rPr>
+        <w:t xml:space="preserve"> </w:t>
+      </w:r>
+      <w:proofErr w:type="spellStart"/>
+      <w:r>
+        <w:rPr>
+          <w:rFonts w:eastAsia="Times New Roman" w:cs="Courier New"/>
+          <w:kern w:val="0"/>
+          <w14:ligatures w14:val="none"/>
+        </w:rPr>
+        <w:t>prisma</w:t>
+      </w:r>
+      <w:proofErr w:type="spellEnd"/>
+      <w:r>
+        <w:rPr>
+          <w:rFonts w:eastAsia="Times New Roman" w:cs="Courier New"/>
+          <w:kern w:val="0"/>
+          <w14:ligatures w14:val="none"/>
+        </w:rPr>
+        <w:t xml:space="preserve"> </w:t>
+      </w:r>
+      <w:proofErr w:type="spellStart"/>
+      <w:r>
+        <w:rPr>
+          <w:rFonts w:eastAsia="Times New Roman" w:cs="Courier New"/>
+          <w:kern w:val="0"/>
+          <w14:ligatures w14:val="none"/>
+        </w:rPr>
+        <w:t>db</w:t>
+      </w:r>
+      <w:proofErr w:type="spellEnd"/>
+      <w:r>
+        <w:rPr>
+          <w:rFonts w:eastAsia="Times New Roman" w:cs="Courier New"/>
+          <w:kern w:val="0"/>
+          <w14:ligatures w14:val="none"/>
+        </w:rPr>
+        <w:t xml:space="preserve"> push</w:t>
+      </w:r>
+    </w:p>
+    <w:p>
+      <w:pPr>
+        <w:pBdr>
+          <w:top w:val="single" w:sz="6" w:space="12" w:color="313131"/>
+          <w:left w:val="single" w:sz="6" w:space="12" w:color="313131"/>
+          <w:bottom w:val="single" w:sz="6" w:space="12" w:color="313131"/>
+          <w:right w:val="single" w:sz="6" w:space="12" w:color="313131"/>
+        </w:pBdr>
+        <w:shd w:val="clear" w:color="auto" w:fill="2B2B2B"/>
+        <w:tabs>
+          <w:tab w:val="left" w:pos="916"/>
+          <w:tab w:val="left" w:pos="1832"/>
+          <w:tab w:val="left" w:pos="2748"/>
+          <w:tab w:val="left" w:pos="3664"/>
+          <w:tab w:val="left" w:pos="4580"/>
+          <w:tab w:val="left" w:pos="5496"/>
+          <w:tab w:val="left" w:pos="6412"/>
+          <w:tab w:val="left" w:pos="7328"/>
+          <w:tab w:val="left" w:pos="8244"/>
+          <w:tab w:val="left" w:pos="9160"/>
+          <w:tab w:val="left" w:pos="10076"/>
+          <w:tab w:val="left" w:pos="10992"/>
+          <w:tab w:val="left" w:pos="11908"/>
+          <w:tab w:val="left" w:pos="12824"/>
+          <w:tab w:val="left" w:pos="13740"/>
+          <w:tab w:val="left" w:pos="14656"/>
+        </w:tabs>
+        <w:spacing w:after="0" w:line="326" w:lineRule="atLeast"/>
+        <w:rPr>
+          <w:rFonts w:eastAsia="Times New Roman" w:cs="Courier New"/>
+          <w:kern w:val="0"/>
+          <w14:ligatures w14:val="none"/>
+        </w:rPr>
+      </w:pPr>
+      <w:proofErr w:type="spellStart"/>
+      <w:r>
+        <w:rPr>
+          <w:rFonts w:eastAsia="Times New Roman" w:cs="Courier New"/>
+          <w:kern w:val="0"/>
+          <w14:ligatures w14:val="none"/>
+        </w:rPr>
+        <w:t>pnpm</w:t>
+      </w:r>
+      <w:proofErr w:type="spellEnd"/>
+      <w:r>
+        <w:rPr>
+          <w:rFonts w:eastAsia="Times New Roman" w:cs="Courier New"/>
+          <w:kern w:val="0"/>
+          <w14:ligatures w14:val="none"/>
+        </w:rPr>
+        <w:t xml:space="preserve"> </w:t>
+      </w:r>
+      <w:proofErr w:type="spellStart"/>
+      <w:r>
+        <w:rPr>
+          <w:rFonts w:eastAsia="Times New Roman" w:cs="Courier New"/>
+          <w:kern w:val="0"/>
+          <w14:ligatures w14:val="none"/>
+        </w:rPr>
+        <w:t>prisma</w:t>
+      </w:r>
+      <w:proofErr w:type="spellEnd"/>
+      <w:r>
+        <w:rPr>
+          <w:rFonts w:eastAsia="Times New Roman" w:cs="Courier New"/>
+          <w:kern w:val="0"/>
+          <w14:ligatures w14:val="none"/>
+        </w:rPr>
+        <w:t xml:space="preserve"> </w:t>
+      </w:r>
+      <w:proofErr w:type="spellStart"/>
+      <w:r>
+        <w:rPr>
+          <w:rFonts w:eastAsia="Times New Roman" w:cs="Courier New"/>
+          <w:kern w:val="0"/>
+          <w14:ligatures w14:val="none"/>
+        </w:rPr>
+        <w:t>db</w:t>
+      </w:r>
+      <w:proofErr w:type="spellEnd"/>
+      <w:r>
+        <w:rPr>
+          <w:rFonts w:eastAsia="Times New Roman" w:cs="Courier New"/>
+          <w:kern w:val="0"/>
+          <w14:ligatures w14:val="none"/>
+        </w:rPr>
+        <w:t xml:space="preserve"> seed</w:t>
+      </w:r>
+    </w:p>
+    <w:p>
+      <w:pPr>
+        <w:pBdr>
+          <w:top w:val="single" w:sz="6" w:space="12" w:color="313131"/>
+          <w:left w:val="single" w:sz="6" w:space="12" w:color="313131"/>
+          <w:bottom w:val="single" w:sz="6" w:space="12" w:color="313131"/>
+          <w:right w:val="single" w:sz="6" w:space="12" w:color="313131"/>
+        </w:pBdr>
+        <w:shd w:val="clear" w:color="auto" w:fill="2B2B2B"/>
+        <w:tabs>
+          <w:tab w:val="left" w:pos="916"/>
+          <w:tab w:val="left" w:pos="1832"/>
+          <w:tab w:val="left" w:pos="2748"/>
+          <w:tab w:val="left" w:pos="3664"/>
+          <w:tab w:val="left" w:pos="4580"/>
+          <w:tab w:val="left" w:pos="5496"/>
+          <w:tab w:val="left" w:pos="6412"/>
+          <w:tab w:val="left" w:pos="7328"/>
+          <w:tab w:val="left" w:pos="8244"/>
+          <w:tab w:val="left" w:pos="9160"/>
+          <w:tab w:val="left" w:pos="10076"/>
+          <w:tab w:val="left" w:pos="10992"/>
+          <w:tab w:val="left" w:pos="11908"/>
+          <w:tab w:val="left" w:pos="12824"/>
+          <w:tab w:val="left" w:pos="13740"/>
+          <w:tab w:val="left" w:pos="14656"/>
+        </w:tabs>
+        <w:spacing w:after="0" w:line="326" w:lineRule="atLeast"/>
+        <w:rPr>
+          <w:rFonts w:eastAsia="Times New Roman" w:cs="Courier New"/>
+          <w:kern w:val="0"/>
+          <w14:ligatures w14:val="none"/>
+        </w:rPr>
+      </w:pPr>
+      <w:r>
+        <w:rPr>
+          <w:rFonts w:eastAsia="Times New Roman" w:cs="Courier New"/>
+          <w:kern w:val="0"/>
+          <w14:ligatures w14:val="none"/>
+        </w:rPr>
+        <w:t>cd</w:t>
+      </w:r>
+      <w:proofErr w:type="gramStart"/>
+      <w:r>
+        <w:rPr>
+          <w:rFonts w:eastAsia="Times New Roman" w:cs="Courier New"/>
+          <w:kern w:val="0"/>
+          <w14:ligatures w14:val="none"/>
+        </w:rPr>
+        <w:t xml:space="preserve"> ../..</w:t>
+      </w:r>
+      <w:proofErr w:type="gramEnd"/>
+    </w:p>
+    <w:p>
+      <w:pPr>
+        <w:spacing w:before="360" w:after="240" w:line="240" w:lineRule="auto"/>
+        <w:outlineLvl w:val="1"/>
+        <w:rPr>
+          <w:rFonts w:eastAsia="Times New Roman" w:cs="Segoe UI"/>
+          <w:b/>
+          <w:bCs/>
+          <w:kern w:val="0"/>
+          <w14:ligatures w14:val="none"/>
+        </w:rPr>
+      </w:pPr>
+      <w:r>
+        <w:rPr>
+          <w:rFonts w:eastAsia="Times New Roman" w:cs="Segoe UI"/>
+          <w:b/>
+          <w:bCs/>
+          <w:kern w:val="0"/>
+          <w14:ligatures w14:val="none"/>
+        </w:rPr>
+        <w:t>Running the Application</w:t>
+      </w:r>
+    </w:p>
+    <w:p>
+      <w:pPr>
+        <w:spacing w:after="240" w:line="240" w:lineRule="auto"/>
+        <w:rPr>
+          <w:rFonts w:eastAsia="Times New Roman" w:cs="Segoe UI"/>
+          <w:kern w:val="0"/>
+          <w14:ligatures w14:val="none"/>
+        </w:rPr>
+      </w:pPr>
+      <w:r>
+        <w:rPr>
+          <w:rFonts w:eastAsia="Times New Roman" w:cs="Segoe UI"/>
+          <w:kern w:val="0"/>
+          <w14:ligatures w14:val="none"/>
+        </w:rPr>
+        <w:t>From the </w:t>
+      </w:r>
+      <w:r>
+        <w:rPr>
+          <w:rFonts w:eastAsia="Times New Roman" w:cs="Courier New"/>
+          <w:color w:val="FFFFFF" w:themeColor="background1"/>
+          <w:kern w:val="0"/>
+          <w:shd w:val="clear" w:color="auto" w:fill="3C3C3C"/>
+          <w14:ligatures w14:val="none"/>
+        </w:rPr>
+        <w:t>find-a-pump-code</w:t>
+      </w:r>
+      <w:r>
+        <w:rPr>
+          <w:rFonts w:eastAsia="Times New Roman" w:cs="Segoe UI"/>
+          <w:color w:val="FFFFFF" w:themeColor="background1"/>
+          <w:kern w:val="0"/>
+          <w14:ligatures w14:val="none"/>
+        </w:rPr>
+        <w:t> </w:t>
+      </w:r>
+      <w:r>
+        <w:rPr>
+          <w:rFonts w:eastAsia="Times New Roman" w:cs="Segoe UI"/>
+          <w:kern w:val="0"/>
+          <w14:ligatures w14:val="none"/>
+        </w:rPr>
+        <w:t>directory:</w:t>
+      </w:r>
+    </w:p>
+    <w:p>
+      <w:pPr>
+        <w:pBdr>
+          <w:top w:val="single" w:sz="6" w:space="12" w:color="313131"/>
+          <w:left w:val="single" w:sz="6" w:space="12" w:color="313131"/>
+          <w:bottom w:val="single" w:sz="6" w:space="12" w:color="313131"/>
+          <w:right w:val="single" w:sz="6" w:space="12" w:color="313131"/>
+        </w:pBdr>
+        <w:shd w:val="clear" w:color="auto" w:fill="2B2B2B"/>
+        <w:tabs>
+          <w:tab w:val="left" w:pos="916"/>
+          <w:tab w:val="left" w:pos="1832"/>
+          <w:tab w:val="left" w:pos="2748"/>
+          <w:tab w:val="left" w:pos="3664"/>
+          <w:tab w:val="left" w:pos="4580"/>
+          <w:tab w:val="left" w:pos="5496"/>
+          <w:tab w:val="left" w:pos="6412"/>
+          <w:tab w:val="left" w:pos="7328"/>
+          <w:tab w:val="left" w:pos="8244"/>
+          <w:tab w:val="left" w:pos="9160"/>
+          <w:tab w:val="left" w:pos="10076"/>
+          <w:tab w:val="left" w:pos="10992"/>
+          <w:tab w:val="left" w:pos="11908"/>
+          <w:tab w:val="left" w:pos="12824"/>
+          <w:tab w:val="left" w:pos="13740"/>
+          <w:tab w:val="left" w:pos="14656"/>
+        </w:tabs>
+        <w:spacing w:after="0" w:line="326" w:lineRule="atLeast"/>
+        <w:rPr>
+          <w:rFonts w:eastAsia="Times New Roman" w:cs="Courier New"/>
+          <w:kern w:val="0"/>
+          <w14:ligatures w14:val="none"/>
+        </w:rPr>
+      </w:pPr>
+      <w:proofErr w:type="spellStart"/>
+      <w:r>
+        <w:rPr>
+          <w:rFonts w:eastAsia="Times New Roman" w:cs="Courier New"/>
+          <w:kern w:val="0"/>
+          <w14:ligatures w14:val="none"/>
+        </w:rPr>
+        <w:t>pnpm</w:t>
+      </w:r>
+      <w:proofErr w:type="spellEnd"/>
+      <w:r>
+        <w:rPr>
+          <w:rFonts w:eastAsia="Times New Roman" w:cs="Courier New"/>
+          <w:kern w:val="0"/>
+          <w14:ligatures w14:val="none"/>
+        </w:rPr>
+        <w:t xml:space="preserve"> run dev</w:t>
+      </w:r>
+    </w:p>
+    <w:p>
+      <w:pPr>
+        <w:spacing w:after="240" w:line="240" w:lineRule="auto"/>
+        <w:rPr>
+          <w:rFonts w:eastAsia="Times New Roman" w:cs="Segoe UI"/>
+          <w:kern w:val="0"/>
+          <w14:ligatures w14:val="none"/>
+        </w:rPr>
+      </w:pPr>
+      <w:r>
+        <w:rPr>
+          <w:rFonts w:eastAsia="Times New Roman" w:cs="Segoe UI"/>
+          <w:kern w:val="0"/>
+          <w14:ligatures w14:val="none"/>
+        </w:rPr>
+        <w:t xml:space="preserve">This </w:t>
+      </w:r>
+      <w:proofErr w:type="gramStart"/>
+      <w:r>
+        <w:rPr>
+          <w:rFonts w:eastAsia="Times New Roman" w:cs="Segoe UI"/>
+          <w:kern w:val="0"/>
+          <w14:ligatures w14:val="none"/>
+        </w:rPr>
+        <w:t>starts</w:t>
+      </w:r>
+      <w:proofErr w:type="gramEnd"/>
+      <w:r>
+        <w:rPr>
+          <w:rFonts w:eastAsia="Times New Roman" w:cs="Segoe UI"/>
+          <w:kern w:val="0"/>
+          <w14:ligatures w14:val="none"/>
+        </w:rPr>
+        <w:t xml:space="preserve"> both applications:</w:t>
+      </w:r>
+    </w:p>
+    <w:p>
+      <w:pPr>
+        <w:numPr>
+          <w:ilvl w:val="0"/>
+          <w:numId w:val="35"/>
+        </w:numPr>
+        <w:spacing w:before="100" w:beforeAutospacing="1" w:after="100" w:afterAutospacing="1" w:line="240" w:lineRule="auto"/>
+        <w:rPr>
+          <w:rFonts w:eastAsia="Times New Roman" w:cs="Segoe UI"/>
+          <w:kern w:val="0"/>
+          <w14:ligatures w14:val="none"/>
+        </w:rPr>
+      </w:pPr>
+      <w:r>
+        <w:rPr>
+          <w:rFonts w:eastAsia="Times New Roman" w:cs="Segoe UI"/>
+          <w:kern w:val="0"/>
+          <w14:ligatures w14:val="none"/>
+        </w:rPr>
+        <w:t>Frontend: </w:t>
+      </w:r>
+      <w:hyperlink r:id="rId20" w:history="1">
+        <w:r>
+          <w:rPr>
+            <w:rFonts w:eastAsia="Times New Roman" w:cs="Segoe UI"/>
+            <w:kern w:val="0"/>
+            <w:u w:val="single"/>
+            <w14:ligatures w14:val="none"/>
+          </w:rPr>
+          <w:t>http://localhost:3000</w:t>
+        </w:r>
+      </w:hyperlink>
+    </w:p>
+    <w:p>
+      <w:pPr>
+        <w:numPr>
+          <w:ilvl w:val="0"/>
+          <w:numId w:val="35"/>
+        </w:numPr>
+        <w:spacing w:before="100" w:beforeAutospacing="1" w:after="100" w:afterAutospacing="1" w:line="240" w:lineRule="auto"/>
+        <w:rPr>
+          <w:rFonts w:eastAsia="Times New Roman" w:cs="Segoe UI"/>
+          <w:kern w:val="0"/>
+          <w14:ligatures w14:val="none"/>
+        </w:rPr>
+      </w:pPr>
+      <w:r>
+        <w:rPr>
+          <w:rFonts w:eastAsia="Times New Roman" w:cs="Segoe UI"/>
+          <w:kern w:val="0"/>
+          <w14:ligatures w14:val="none"/>
+        </w:rPr>
+        <w:t>Backend: </w:t>
+      </w:r>
+      <w:hyperlink r:id="rId21" w:history="1">
+        <w:r>
+          <w:rPr>
+            <w:rFonts w:eastAsia="Times New Roman" w:cs="Segoe UI"/>
+            <w:kern w:val="0"/>
+            <w:u w:val="single"/>
+            <w14:ligatures w14:val="none"/>
+          </w:rPr>
+          <w:t>http://localhost:4000</w:t>
+        </w:r>
+      </w:hyperlink>
+    </w:p>
+    <w:p>
+      <w:pPr>
+        <w:spacing w:after="240" w:line="240" w:lineRule="auto"/>
+        <w:rPr>
+          <w:rFonts w:eastAsia="Times New Roman" w:cs="Segoe UI"/>
+          <w:kern w:val="0"/>
+          <w14:ligatures w14:val="none"/>
+        </w:rPr>
+      </w:pPr>
+      <w:r>
+        <w:rPr>
+          <w:rFonts w:eastAsia="Times New Roman" w:cs="Segoe UI"/>
+          <w:kern w:val="0"/>
+          <w14:ligatures w14:val="none"/>
+        </w:rPr>
+        <w:t>Restart the development server after modifying environment variables.</w:t>
+      </w:r>
+    </w:p>
+    <w:p>
+      <w:pPr>
+        <w:spacing w:before="360" w:after="240" w:line="240" w:lineRule="auto"/>
+        <w:outlineLvl w:val="1"/>
+        <w:rPr>
+          <w:rFonts w:eastAsia="Times New Roman" w:cs="Segoe UI"/>
+          <w:b/>
+          <w:bCs/>
+          <w:kern w:val="0"/>
+          <w14:ligatures w14:val="none"/>
+        </w:rPr>
+      </w:pPr>
+      <w:r>
+        <w:rPr>
+          <w:rFonts w:eastAsia="Times New Roman" w:cs="Segoe UI"/>
+          <w:b/>
+          <w:bCs/>
+          <w:kern w:val="0"/>
+          <w14:ligatures w14:val="none"/>
+        </w:rPr>
+        <w:t>Viewing the Database (Optional)</w:t>
+      </w:r>
+    </w:p>
+    <w:p>
+      <w:pPr>
+        <w:spacing w:after="240" w:line="240" w:lineRule="auto"/>
+        <w:rPr>
+          <w:rFonts w:eastAsia="Times New Roman" w:cs="Segoe UI"/>
+          <w:kern w:val="0"/>
+          <w14:ligatures w14:val="none"/>
+        </w:rPr>
+      </w:pPr>
+      <w:r>
+        <w:rPr>
+          <w:rFonts w:eastAsia="Times New Roman" w:cs="Segoe UI"/>
+          <w:kern w:val="0"/>
+          <w14:ligatures w14:val="none"/>
+        </w:rPr>
+        <w:t>To inspect the database:</w:t>
+      </w:r>
+    </w:p>
+    <w:p>
+      <w:pPr>
+        <w:pBdr>
+          <w:top w:val="single" w:sz="6" w:space="12" w:color="313131"/>
+          <w:left w:val="single" w:sz="6" w:space="12" w:color="313131"/>
+          <w:bottom w:val="single" w:sz="6" w:space="12" w:color="313131"/>
+          <w:right w:val="single" w:sz="6" w:space="12" w:color="313131"/>
+        </w:pBdr>
+        <w:shd w:val="clear" w:color="auto" w:fill="2B2B2B"/>
+        <w:tabs>
+          <w:tab w:val="left" w:pos="916"/>
+          <w:tab w:val="left" w:pos="1832"/>
+          <w:tab w:val="left" w:pos="2748"/>
+          <w:tab w:val="left" w:pos="3664"/>
+          <w:tab w:val="left" w:pos="4580"/>
+          <w:tab w:val="left" w:pos="5496"/>
+          <w:tab w:val="left" w:pos="6412"/>
+          <w:tab w:val="left" w:pos="7328"/>
+          <w:tab w:val="left" w:pos="8244"/>
+          <w:tab w:val="left" w:pos="9160"/>
+          <w:tab w:val="left" w:pos="10076"/>
+          <w:tab w:val="left" w:pos="10992"/>
+          <w:tab w:val="left" w:pos="11908"/>
+          <w:tab w:val="left" w:pos="12824"/>
+          <w:tab w:val="left" w:pos="13740"/>
+          <w:tab w:val="left" w:pos="14656"/>
+        </w:tabs>
+        <w:spacing w:after="0" w:line="326" w:lineRule="atLeast"/>
+        <w:rPr>
+          <w:rFonts w:eastAsia="Times New Roman" w:cs="Courier New"/>
+          <w:kern w:val="0"/>
+          <w14:ligatures w14:val="none"/>
+        </w:rPr>
+      </w:pPr>
+      <w:r>
+        <w:rPr>
+          <w:rFonts w:eastAsia="Times New Roman" w:cs="Courier New"/>
+          <w:kern w:val="0"/>
+          <w14:ligatures w14:val="none"/>
+        </w:rPr>
+        <w:t>cd apps/backend</w:t>
+      </w:r>
+    </w:p>
+    <w:p>
+      <w:pPr>
+        <w:pBdr>
+          <w:top w:val="single" w:sz="6" w:space="12" w:color="313131"/>
+          <w:left w:val="single" w:sz="6" w:space="12" w:color="313131"/>
+          <w:bottom w:val="single" w:sz="6" w:space="12" w:color="313131"/>
+          <w:right w:val="single" w:sz="6" w:space="12" w:color="313131"/>
+        </w:pBdr>
+        <w:shd w:val="clear" w:color="auto" w:fill="2B2B2B"/>
+        <w:tabs>
+          <w:tab w:val="left" w:pos="916"/>
+          <w:tab w:val="left" w:pos="1832"/>
+          <w:tab w:val="left" w:pos="2748"/>
+          <w:tab w:val="left" w:pos="3664"/>
+          <w:tab w:val="left" w:pos="4580"/>
+          <w:tab w:val="left" w:pos="5496"/>
+          <w:tab w:val="left" w:pos="6412"/>
+          <w:tab w:val="left" w:pos="7328"/>
+          <w:tab w:val="left" w:pos="8244"/>
+          <w:tab w:val="left" w:pos="9160"/>
+          <w:tab w:val="left" w:pos="10076"/>
+          <w:tab w:val="left" w:pos="10992"/>
+          <w:tab w:val="left" w:pos="11908"/>
+          <w:tab w:val="left" w:pos="12824"/>
+          <w:tab w:val="left" w:pos="13740"/>
+          <w:tab w:val="left" w:pos="14656"/>
+        </w:tabs>
+        <w:spacing w:after="0" w:line="326" w:lineRule="atLeast"/>
+        <w:rPr>
+          <w:rFonts w:eastAsia="Times New Roman" w:cs="Courier New"/>
+          <w:kern w:val="0"/>
+          <w14:ligatures w14:val="none"/>
+        </w:rPr>
+      </w:pPr>
+      <w:proofErr w:type="spellStart"/>
+      <w:r>
+        <w:rPr>
+          <w:rFonts w:eastAsia="Times New Roman" w:cs="Courier New"/>
+          <w:kern w:val="0"/>
+          <w14:ligatures w14:val="none"/>
+        </w:rPr>
+        <w:t>pnpm</w:t>
+      </w:r>
+      <w:proofErr w:type="spellEnd"/>
+      <w:r>
+        <w:rPr>
+          <w:rFonts w:eastAsia="Times New Roman" w:cs="Courier New"/>
+          <w:kern w:val="0"/>
+          <w14:ligatures w14:val="none"/>
+        </w:rPr>
+        <w:t xml:space="preserve"> </w:t>
+      </w:r>
+      <w:proofErr w:type="spellStart"/>
+      <w:r>
+        <w:rPr>
+          <w:rFonts w:eastAsia="Times New Roman" w:cs="Courier New"/>
+          <w:kern w:val="0"/>
+          <w14:ligatures w14:val="none"/>
+        </w:rPr>
+        <w:t>prisma</w:t>
+      </w:r>
+      <w:proofErr w:type="spellEnd"/>
+      <w:r>
+        <w:rPr>
+          <w:rFonts w:eastAsia="Times New Roman" w:cs="Courier New"/>
+          <w:kern w:val="0"/>
+          <w14:ligatures w14:val="none"/>
+        </w:rPr>
+        <w:t xml:space="preserve"> studio</w:t>
+      </w:r>
+    </w:p>
+    <w:p>
+      <w:pPr>
+        <w:spacing w:after="240" w:line="240" w:lineRule="auto"/>
+        <w:rPr>
+          <w:rFonts w:eastAsia="Times New Roman" w:cs="Segoe UI"/>
+          <w:kern w:val="0"/>
+          <w14:ligatures w14:val="none"/>
+        </w:rPr>
+      </w:pPr>
+      <w:r>
+        <w:rPr>
+          <w:rFonts w:eastAsia="Times New Roman" w:cs="Segoe UI"/>
+          <w:kern w:val="0"/>
+          <w14:ligatures w14:val="none"/>
+        </w:rPr>
+        <w:t>Then visit:</w:t>
+      </w:r>
+    </w:p>
+    <w:p>
+      <w:pPr>
+        <w:spacing w:after="240" w:line="240" w:lineRule="auto"/>
+        <w:rPr>
+          <w:rFonts w:eastAsia="Times New Roman" w:cs="Segoe UI"/>
+          <w:kern w:val="0"/>
+          <w14:ligatures w14:val="none"/>
+        </w:rPr>
+      </w:pPr>
+      <w:hyperlink r:id="rId22" w:history="1">
+        <w:r>
+          <w:rPr>
+            <w:rFonts w:eastAsia="Times New Roman" w:cs="Segoe UI"/>
+            <w:kern w:val="0"/>
+            <w:u w:val="single"/>
+            <w14:ligatures w14:val="none"/>
+          </w:rPr>
+          <w:t>http://localhost:5555</w:t>
+        </w:r>
+      </w:hyperlink>
+    </w:p>
+    <w:p>
+      <w:pPr>
+        <w:spacing w:before="360" w:after="240" w:line="240" w:lineRule="auto"/>
+        <w:outlineLvl w:val="1"/>
+        <w:rPr>
+          <w:rFonts w:eastAsia="Times New Roman" w:cs="Segoe UI"/>
+          <w:b/>
+          <w:bCs/>
+          <w:kern w:val="0"/>
+          <w14:ligatures w14:val="none"/>
+        </w:rPr>
+      </w:pPr>
+      <w:r>
+        <w:rPr>
+          <w:rFonts w:eastAsia="Times New Roman" w:cs="Segoe UI"/>
+          <w:b/>
+          <w:bCs/>
+          <w:kern w:val="0"/>
+          <w14:ligatures w14:val="none"/>
+        </w:rPr>
+        <w:lastRenderedPageBreak/>
+        <w:t>Backend Architecture</w:t>
+      </w:r>
+    </w:p>
+    <w:p>
+      <w:pPr>
+        <w:spacing w:after="240" w:line="240" w:lineRule="auto"/>
+        <w:rPr>
+          <w:rFonts w:eastAsia="Times New Roman" w:cs="Segoe UI"/>
+          <w:kern w:val="0"/>
+          <w14:ligatures w14:val="none"/>
+        </w:rPr>
+      </w:pPr>
+      <w:r>
+        <w:rPr>
+          <w:rFonts w:eastAsia="Times New Roman" w:cs="Segoe UI"/>
+          <w:kern w:val="0"/>
+          <w14:ligatures w14:val="none"/>
+        </w:rPr>
+        <w:t>The backend uses structured separation:</w:t>
+      </w:r>
+    </w:p>
+    <w:p>
+      <w:pPr>
+        <w:numPr>
+          <w:ilvl w:val="0"/>
+          <w:numId w:val="36"/>
+        </w:numPr>
+        <w:spacing w:before="100" w:beforeAutospacing="1" w:after="100" w:afterAutospacing="1" w:line="240" w:lineRule="auto"/>
+        <w:rPr>
+          <w:rFonts w:eastAsia="Times New Roman" w:cs="Segoe UI"/>
+          <w:kern w:val="0"/>
+          <w14:ligatures w14:val="none"/>
+        </w:rPr>
+      </w:pPr>
+      <w:r>
+        <w:rPr>
+          <w:rFonts w:eastAsia="Times New Roman" w:cs="Courier New"/>
+          <w:color w:val="FFFFFF" w:themeColor="background1"/>
+          <w:kern w:val="0"/>
+          <w:shd w:val="clear" w:color="auto" w:fill="3C3C3C"/>
+          <w14:ligatures w14:val="none"/>
+        </w:rPr>
+        <w:t>routes/</w:t>
+      </w:r>
+      <w:r>
+        <w:rPr>
+          <w:rFonts w:eastAsia="Times New Roman" w:cs="Segoe UI"/>
+          <w:color w:val="FFFFFF" w:themeColor="background1"/>
+          <w:kern w:val="0"/>
+          <w14:ligatures w14:val="none"/>
+        </w:rPr>
+        <w:t> </w:t>
+      </w:r>
+      <w:r>
+        <w:rPr>
+          <w:rFonts w:eastAsia="Times New Roman" w:cs="Segoe UI"/>
+          <w:kern w:val="0"/>
+          <w14:ligatures w14:val="none"/>
+        </w:rPr>
+        <w:t>– Defines API endpoints</w:t>
+      </w:r>
+    </w:p>
+    <w:p>
+      <w:pPr>
+        <w:numPr>
+          <w:ilvl w:val="0"/>
+          <w:numId w:val="36"/>
+        </w:numPr>
+        <w:spacing w:before="100" w:beforeAutospacing="1" w:after="100" w:afterAutospacing="1" w:line="240" w:lineRule="auto"/>
+        <w:rPr>
+          <w:rFonts w:eastAsia="Times New Roman" w:cs="Segoe UI"/>
+          <w:kern w:val="0"/>
+          <w14:ligatures w14:val="none"/>
+        </w:rPr>
+      </w:pPr>
+      <w:r>
+        <w:rPr>
+          <w:rFonts w:eastAsia="Times New Roman" w:cs="Courier New"/>
+          <w:color w:val="FFFFFF" w:themeColor="background1"/>
+          <w:kern w:val="0"/>
+          <w:shd w:val="clear" w:color="auto" w:fill="3C3C3C"/>
+          <w14:ligatures w14:val="none"/>
+        </w:rPr>
+        <w:t>controllers/</w:t>
+      </w:r>
+      <w:r>
+        <w:rPr>
+          <w:rFonts w:eastAsia="Times New Roman" w:cs="Segoe UI"/>
+          <w:color w:val="FFFFFF" w:themeColor="background1"/>
+          <w:kern w:val="0"/>
+          <w14:ligatures w14:val="none"/>
+        </w:rPr>
+        <w:t> </w:t>
+      </w:r>
+      <w:r>
+        <w:rPr>
+          <w:rFonts w:eastAsia="Times New Roman" w:cs="Segoe UI"/>
+          <w:kern w:val="0"/>
+          <w14:ligatures w14:val="none"/>
+        </w:rPr>
+        <w:t>– Handles validation and HTTP responses</w:t>
+      </w:r>
+    </w:p>
+    <w:p>
+      <w:pPr>
+        <w:numPr>
+          <w:ilvl w:val="0"/>
+          <w:numId w:val="36"/>
+        </w:numPr>
+        <w:spacing w:before="100" w:beforeAutospacing="1" w:after="100" w:afterAutospacing="1" w:line="240" w:lineRule="auto"/>
+        <w:rPr>
+          <w:rFonts w:eastAsia="Times New Roman" w:cs="Segoe UI"/>
+          <w:kern w:val="0"/>
+          <w14:ligatures w14:val="none"/>
+        </w:rPr>
+      </w:pPr>
+      <w:r>
+        <w:rPr>
+          <w:rFonts w:eastAsia="Times New Roman" w:cs="Courier New"/>
+          <w:color w:val="FFFFFF" w:themeColor="background1"/>
+          <w:kern w:val="0"/>
+          <w:shd w:val="clear" w:color="auto" w:fill="3C3C3C"/>
+          <w14:ligatures w14:val="none"/>
+        </w:rPr>
+        <w:t>services/</w:t>
+      </w:r>
+      <w:r>
+        <w:rPr>
+          <w:rFonts w:eastAsia="Times New Roman" w:cs="Segoe UI"/>
+          <w:color w:val="FFFFFF" w:themeColor="background1"/>
+          <w:kern w:val="0"/>
+          <w14:ligatures w14:val="none"/>
+        </w:rPr>
+        <w:t> </w:t>
+      </w:r>
+      <w:r>
+        <w:rPr>
+          <w:rFonts w:eastAsia="Times New Roman" w:cs="Segoe UI"/>
+          <w:kern w:val="0"/>
+          <w14:ligatures w14:val="none"/>
+        </w:rPr>
+        <w:t>– Contains business logic and database operations</w:t>
+      </w:r>
+    </w:p>
+    <w:p>
+      <w:pPr>
+        <w:spacing w:after="240" w:line="240" w:lineRule="auto"/>
+        <w:rPr>
+          <w:rFonts w:eastAsia="Times New Roman" w:cs="Segoe UI"/>
+          <w:kern w:val="0"/>
+          <w14:ligatures w14:val="none"/>
+        </w:rPr>
+      </w:pPr>
+      <w:r>
+        <w:rPr>
+          <w:rFonts w:eastAsia="Times New Roman" w:cs="Segoe UI"/>
+          <w:kern w:val="0"/>
+          <w14:ligatures w14:val="none"/>
+        </w:rPr>
+        <w:t>This structure improves maintainability, scalability, and clarity.</w:t>
+      </w:r>
+    </w:p>
+    <w:p>
+      <w:pPr>
+        <w:rPr>
+          <w:b/>
+          <w:bCs/>
+        </w:rPr>
+      </w:pPr>
+    </w:p>
     <w:sectPr>
       <w:pgSz w:w="12240" w:h="15840"/>
       <w:pgMar w:top="1440" w:right="1440" w:bottom="1440" w:left="1440" w:header="720" w:footer="720" w:gutter="0"/>
@@ -5030,6 +7912,453 @@
     </w:lvl>
   </w:abstractNum>
   <w:abstractNum w:abstractNumId="12" w15:restartNumberingAfterBreak="0">
+    <w:nsid w:val="3B4468FD"/>
+    <w:multiLevelType w:val="multilevel"/>
+    <w:tmpl w:val="10E47CA8"/>
+    <w:lvl w:ilvl="0">
+      <w:start w:val="1"/>
+      <w:numFmt w:val="bullet"/>
+      <w:lvlText w:val=""/>
+      <w:lvlJc w:val="left"/>
+      <w:pPr>
+        <w:tabs>
+          <w:tab w:val="num" w:pos="720"/>
+        </w:tabs>
+        <w:ind w:left="720" w:hanging="360"/>
+      </w:pPr>
+      <w:rPr>
+        <w:rFonts w:ascii="Symbol" w:hAnsi="Symbol" w:hint="default"/>
+        <w:sz w:val="20"/>
+      </w:rPr>
+    </w:lvl>
+    <w:lvl w:ilvl="1" w:tentative="1">
+      <w:start w:val="1"/>
+      <w:numFmt w:val="bullet"/>
+      <w:lvlText w:val="o"/>
+      <w:lvlJc w:val="left"/>
+      <w:pPr>
+        <w:tabs>
+          <w:tab w:val="num" w:pos="1440"/>
+        </w:tabs>
+        <w:ind w:left="1440" w:hanging="360"/>
+      </w:pPr>
+      <w:rPr>
+        <w:rFonts w:ascii="Courier New" w:hAnsi="Courier New" w:hint="default"/>
+        <w:sz w:val="20"/>
+      </w:rPr>
+    </w:lvl>
+    <w:lvl w:ilvl="2" w:tentative="1">
+      <w:start w:val="1"/>
+      <w:numFmt w:val="bullet"/>
+      <w:lvlText w:val=""/>
+      <w:lvlJc w:val="left"/>
+      <w:pPr>
+        <w:tabs>
+          <w:tab w:val="num" w:pos="2160"/>
+        </w:tabs>
+        <w:ind w:left="2160" w:hanging="360"/>
+      </w:pPr>
+      <w:rPr>
+        <w:rFonts w:ascii="Wingdings" w:hAnsi="Wingdings" w:hint="default"/>
+        <w:sz w:val="20"/>
+      </w:rPr>
+    </w:lvl>
+    <w:lvl w:ilvl="3" w:tentative="1">
+      <w:start w:val="1"/>
+      <w:numFmt w:val="bullet"/>
+      <w:lvlText w:val=""/>
+      <w:lvlJc w:val="left"/>
+      <w:pPr>
+        <w:tabs>
+          <w:tab w:val="num" w:pos="2880"/>
+        </w:tabs>
+        <w:ind w:left="2880" w:hanging="360"/>
+      </w:pPr>
+      <w:rPr>
+        <w:rFonts w:ascii="Wingdings" w:hAnsi="Wingdings" w:hint="default"/>
+        <w:sz w:val="20"/>
+      </w:rPr>
+    </w:lvl>
+    <w:lvl w:ilvl="4" w:tentative="1">
+      <w:start w:val="1"/>
+      <w:numFmt w:val="bullet"/>
+      <w:lvlText w:val=""/>
+      <w:lvlJc w:val="left"/>
+      <w:pPr>
+        <w:tabs>
+          <w:tab w:val="num" w:pos="3600"/>
+        </w:tabs>
+        <w:ind w:left="3600" w:hanging="360"/>
+      </w:pPr>
+      <w:rPr>
+        <w:rFonts w:ascii="Wingdings" w:hAnsi="Wingdings" w:hint="default"/>
+        <w:sz w:val="20"/>
+      </w:rPr>
+    </w:lvl>
+    <w:lvl w:ilvl="5" w:tentative="1">
+      <w:start w:val="1"/>
+      <w:numFmt w:val="bullet"/>
+      <w:lvlText w:val=""/>
+      <w:lvlJc w:val="left"/>
+      <w:pPr>
+        <w:tabs>
+          <w:tab w:val="num" w:pos="4320"/>
+        </w:tabs>
+        <w:ind w:left="4320" w:hanging="360"/>
+      </w:pPr>
+      <w:rPr>
+        <w:rFonts w:ascii="Wingdings" w:hAnsi="Wingdings" w:hint="default"/>
+        <w:sz w:val="20"/>
+      </w:rPr>
+    </w:lvl>
+    <w:lvl w:ilvl="6" w:tentative="1">
+      <w:start w:val="1"/>
+      <w:numFmt w:val="bullet"/>
+      <w:lvlText w:val=""/>
+      <w:lvlJc w:val="left"/>
+      <w:pPr>
+        <w:tabs>
+          <w:tab w:val="num" w:pos="5040"/>
+        </w:tabs>
+        <w:ind w:left="5040" w:hanging="360"/>
+      </w:pPr>
+      <w:rPr>
+        <w:rFonts w:ascii="Wingdings" w:hAnsi="Wingdings" w:hint="default"/>
+        <w:sz w:val="20"/>
+      </w:rPr>
+    </w:lvl>
+    <w:lvl w:ilvl="7" w:tentative="1">
+      <w:start w:val="1"/>
+      <w:numFmt w:val="bullet"/>
+      <w:lvlText w:val=""/>
+      <w:lvlJc w:val="left"/>
+      <w:pPr>
+        <w:tabs>
+          <w:tab w:val="num" w:pos="5760"/>
+        </w:tabs>
+        <w:ind w:left="5760" w:hanging="360"/>
+      </w:pPr>
+      <w:rPr>
+        <w:rFonts w:ascii="Wingdings" w:hAnsi="Wingdings" w:hint="default"/>
+        <w:sz w:val="20"/>
+      </w:rPr>
+    </w:lvl>
+    <w:lvl w:ilvl="8" w:tentative="1">
+      <w:start w:val="1"/>
+      <w:numFmt w:val="bullet"/>
+      <w:lvlText w:val=""/>
+      <w:lvlJc w:val="left"/>
+      <w:pPr>
+        <w:tabs>
+          <w:tab w:val="num" w:pos="6480"/>
+        </w:tabs>
+        <w:ind w:left="6480" w:hanging="360"/>
+      </w:pPr>
+      <w:rPr>
+        <w:rFonts w:ascii="Wingdings" w:hAnsi="Wingdings" w:hint="default"/>
+        <w:sz w:val="20"/>
+      </w:rPr>
+    </w:lvl>
+  </w:abstractNum>
+  <w:abstractNum w:abstractNumId="13" w15:restartNumberingAfterBreak="0">
+    <w:nsid w:val="41A40511"/>
+    <w:multiLevelType w:val="multilevel"/>
+    <w:tmpl w:val="1CB21EAE"/>
+    <w:lvl w:ilvl="0">
+      <w:start w:val="1"/>
+      <w:numFmt w:val="bullet"/>
+      <w:lvlText w:val=""/>
+      <w:lvlJc w:val="left"/>
+      <w:pPr>
+        <w:tabs>
+          <w:tab w:val="num" w:pos="720"/>
+        </w:tabs>
+        <w:ind w:left="720" w:hanging="360"/>
+      </w:pPr>
+      <w:rPr>
+        <w:rFonts w:ascii="Symbol" w:hAnsi="Symbol" w:hint="default"/>
+        <w:sz w:val="20"/>
+      </w:rPr>
+    </w:lvl>
+    <w:lvl w:ilvl="1" w:tentative="1">
+      <w:start w:val="1"/>
+      <w:numFmt w:val="bullet"/>
+      <w:lvlText w:val="o"/>
+      <w:lvlJc w:val="left"/>
+      <w:pPr>
+        <w:tabs>
+          <w:tab w:val="num" w:pos="1440"/>
+        </w:tabs>
+        <w:ind w:left="1440" w:hanging="360"/>
+      </w:pPr>
+      <w:rPr>
+        <w:rFonts w:ascii="Courier New" w:hAnsi="Courier New" w:hint="default"/>
+        <w:sz w:val="20"/>
+      </w:rPr>
+    </w:lvl>
+    <w:lvl w:ilvl="2" w:tentative="1">
+      <w:start w:val="1"/>
+      <w:numFmt w:val="bullet"/>
+      <w:lvlText w:val=""/>
+      <w:lvlJc w:val="left"/>
+      <w:pPr>
+        <w:tabs>
+          <w:tab w:val="num" w:pos="2160"/>
+        </w:tabs>
+        <w:ind w:left="2160" w:hanging="360"/>
+      </w:pPr>
+      <w:rPr>
+        <w:rFonts w:ascii="Wingdings" w:hAnsi="Wingdings" w:hint="default"/>
+        <w:sz w:val="20"/>
+      </w:rPr>
+    </w:lvl>
+    <w:lvl w:ilvl="3" w:tentative="1">
+      <w:start w:val="1"/>
+      <w:numFmt w:val="bullet"/>
+      <w:lvlText w:val=""/>
+      <w:lvlJc w:val="left"/>
+      <w:pPr>
+        <w:tabs>
+          <w:tab w:val="num" w:pos="2880"/>
+        </w:tabs>
+        <w:ind w:left="2880" w:hanging="360"/>
+      </w:pPr>
+      <w:rPr>
+        <w:rFonts w:ascii="Wingdings" w:hAnsi="Wingdings" w:hint="default"/>
+        <w:sz w:val="20"/>
+      </w:rPr>
+    </w:lvl>
+    <w:lvl w:ilvl="4" w:tentative="1">
+      <w:start w:val="1"/>
+      <w:numFmt w:val="bullet"/>
+      <w:lvlText w:val=""/>
+      <w:lvlJc w:val="left"/>
+      <w:pPr>
+        <w:tabs>
+          <w:tab w:val="num" w:pos="3600"/>
+        </w:tabs>
+        <w:ind w:left="3600" w:hanging="360"/>
+      </w:pPr>
+      <w:rPr>
+        <w:rFonts w:ascii="Wingdings" w:hAnsi="Wingdings" w:hint="default"/>
+        <w:sz w:val="20"/>
+      </w:rPr>
+    </w:lvl>
+    <w:lvl w:ilvl="5" w:tentative="1">
+      <w:start w:val="1"/>
+      <w:numFmt w:val="bullet"/>
+      <w:lvlText w:val=""/>
+      <w:lvlJc w:val="left"/>
+      <w:pPr>
+        <w:tabs>
+          <w:tab w:val="num" w:pos="4320"/>
+        </w:tabs>
+        <w:ind w:left="4320" w:hanging="360"/>
+      </w:pPr>
+      <w:rPr>
+        <w:rFonts w:ascii="Wingdings" w:hAnsi="Wingdings" w:hint="default"/>
+        <w:sz w:val="20"/>
+      </w:rPr>
+    </w:lvl>
+    <w:lvl w:ilvl="6" w:tentative="1">
+      <w:start w:val="1"/>
+      <w:numFmt w:val="bullet"/>
+      <w:lvlText w:val=""/>
+      <w:lvlJc w:val="left"/>
+      <w:pPr>
+        <w:tabs>
+          <w:tab w:val="num" w:pos="5040"/>
+        </w:tabs>
+        <w:ind w:left="5040" w:hanging="360"/>
+      </w:pPr>
+      <w:rPr>
+        <w:rFonts w:ascii="Wingdings" w:hAnsi="Wingdings" w:hint="default"/>
+        <w:sz w:val="20"/>
+      </w:rPr>
+    </w:lvl>
+    <w:lvl w:ilvl="7" w:tentative="1">
+      <w:start w:val="1"/>
+      <w:numFmt w:val="bullet"/>
+      <w:lvlText w:val=""/>
+      <w:lvlJc w:val="left"/>
+      <w:pPr>
+        <w:tabs>
+          <w:tab w:val="num" w:pos="5760"/>
+        </w:tabs>
+        <w:ind w:left="5760" w:hanging="360"/>
+      </w:pPr>
+      <w:rPr>
+        <w:rFonts w:ascii="Wingdings" w:hAnsi="Wingdings" w:hint="default"/>
+        <w:sz w:val="20"/>
+      </w:rPr>
+    </w:lvl>
+    <w:lvl w:ilvl="8" w:tentative="1">
+      <w:start w:val="1"/>
+      <w:numFmt w:val="bullet"/>
+      <w:lvlText w:val=""/>
+      <w:lvlJc w:val="left"/>
+      <w:pPr>
+        <w:tabs>
+          <w:tab w:val="num" w:pos="6480"/>
+        </w:tabs>
+        <w:ind w:left="6480" w:hanging="360"/>
+      </w:pPr>
+      <w:rPr>
+        <w:rFonts w:ascii="Wingdings" w:hAnsi="Wingdings" w:hint="default"/>
+        <w:sz w:val="20"/>
+      </w:rPr>
+    </w:lvl>
+  </w:abstractNum>
+  <w:abstractNum w:abstractNumId="14" w15:restartNumberingAfterBreak="0">
+    <w:nsid w:val="41F05A2F"/>
+    <w:multiLevelType w:val="multilevel"/>
+    <w:tmpl w:val="F884810A"/>
+    <w:lvl w:ilvl="0">
+      <w:start w:val="1"/>
+      <w:numFmt w:val="bullet"/>
+      <w:lvlText w:val=""/>
+      <w:lvlJc w:val="left"/>
+      <w:pPr>
+        <w:tabs>
+          <w:tab w:val="num" w:pos="720"/>
+        </w:tabs>
+        <w:ind w:left="720" w:hanging="360"/>
+      </w:pPr>
+      <w:rPr>
+        <w:rFonts w:ascii="Symbol" w:hAnsi="Symbol" w:hint="default"/>
+        <w:sz w:val="20"/>
+      </w:rPr>
+    </w:lvl>
+    <w:lvl w:ilvl="1" w:tentative="1">
+      <w:start w:val="1"/>
+      <w:numFmt w:val="bullet"/>
+      <w:lvlText w:val="o"/>
+      <w:lvlJc w:val="left"/>
+      <w:pPr>
+        <w:tabs>
+          <w:tab w:val="num" w:pos="1440"/>
+        </w:tabs>
+        <w:ind w:left="1440" w:hanging="360"/>
+      </w:pPr>
+      <w:rPr>
+        <w:rFonts w:ascii="Courier New" w:hAnsi="Courier New" w:hint="default"/>
+        <w:sz w:val="20"/>
+      </w:rPr>
+    </w:lvl>
+    <w:lvl w:ilvl="2" w:tentative="1">
+      <w:start w:val="1"/>
+      <w:numFmt w:val="bullet"/>
+      <w:lvlText w:val=""/>
+      <w:lvlJc w:val="left"/>
+      <w:pPr>
+        <w:tabs>
+          <w:tab w:val="num" w:pos="2160"/>
+        </w:tabs>
+        <w:ind w:left="2160" w:hanging="360"/>
+      </w:pPr>
+      <w:rPr>
+        <w:rFonts w:ascii="Wingdings" w:hAnsi="Wingdings" w:hint="default"/>
+        <w:sz w:val="20"/>
+      </w:rPr>
+    </w:lvl>
+    <w:lvl w:ilvl="3" w:tentative="1">
+      <w:start w:val="1"/>
+      <w:numFmt w:val="bullet"/>
+      <w:lvlText w:val=""/>
+      <w:lvlJc w:val="left"/>
+      <w:pPr>
+        <w:tabs>
+          <w:tab w:val="num" w:pos="2880"/>
+        </w:tabs>
+        <w:ind w:left="2880" w:hanging="360"/>
+      </w:pPr>
+      <w:rPr>
+        <w:rFonts w:ascii="Wingdings" w:hAnsi="Wingdings" w:hint="default"/>
+        <w:sz w:val="20"/>
+      </w:rPr>
+    </w:lvl>
+    <w:lvl w:ilvl="4" w:tentative="1">
+      <w:start w:val="1"/>
+      <w:numFmt w:val="bullet"/>
+      <w:lvlText w:val=""/>
+      <w:lvlJc w:val="left"/>
+      <w:pPr>
+        <w:tabs>
+          <w:tab w:val="num" w:pos="3600"/>
+        </w:tabs>
+        <w:ind w:left="3600" w:hanging="360"/>
+      </w:pPr>
+      <w:rPr>
+        <w:rFonts w:ascii="Wingdings" w:hAnsi="Wingdings" w:hint="default"/>
+        <w:sz w:val="20"/>
+      </w:rPr>
+    </w:lvl>
+    <w:lvl w:ilvl="5" w:tentative="1">
+      <w:start w:val="1"/>
+      <w:numFmt w:val="bullet"/>
+      <w:lvlText w:val=""/>
+      <w:lvlJc w:val="left"/>
+      <w:pPr>
+        <w:tabs>
+          <w:tab w:val="num" w:pos="4320"/>
+        </w:tabs>
+        <w:ind w:left="4320" w:hanging="360"/>
+      </w:pPr>
+      <w:rPr>
+        <w:rFonts w:ascii="Wingdings" w:hAnsi="Wingdings" w:hint="default"/>
+        <w:sz w:val="20"/>
+      </w:rPr>
+    </w:lvl>
+    <w:lvl w:ilvl="6" w:tentative="1">
+      <w:start w:val="1"/>
+      <w:numFmt w:val="bullet"/>
+      <w:lvlText w:val=""/>
+      <w:lvlJc w:val="left"/>
+      <w:pPr>
+        <w:tabs>
+          <w:tab w:val="num" w:pos="5040"/>
+        </w:tabs>
+        <w:ind w:left="5040" w:hanging="360"/>
+      </w:pPr>
+      <w:rPr>
+        <w:rFonts w:ascii="Wingdings" w:hAnsi="Wingdings" w:hint="default"/>
+        <w:sz w:val="20"/>
+      </w:rPr>
+    </w:lvl>
+    <w:lvl w:ilvl="7" w:tentative="1">
+      <w:start w:val="1"/>
+      <w:numFmt w:val="bullet"/>
+      <w:lvlText w:val=""/>
+      <w:lvlJc w:val="left"/>
+      <w:pPr>
+        <w:tabs>
+          <w:tab w:val="num" w:pos="5760"/>
+        </w:tabs>
+        <w:ind w:left="5760" w:hanging="360"/>
+      </w:pPr>
+      <w:rPr>
+        <w:rFonts w:ascii="Wingdings" w:hAnsi="Wingdings" w:hint="default"/>
+        <w:sz w:val="20"/>
+      </w:rPr>
+    </w:lvl>
+    <w:lvl w:ilvl="8" w:tentative="1">
+      <w:start w:val="1"/>
+      <w:numFmt w:val="bullet"/>
+      <w:lvlText w:val=""/>
+      <w:lvlJc w:val="left"/>
+      <w:pPr>
+        <w:tabs>
+          <w:tab w:val="num" w:pos="6480"/>
+        </w:tabs>
+        <w:ind w:left="6480" w:hanging="360"/>
+      </w:pPr>
+      <w:rPr>
+        <w:rFonts w:ascii="Wingdings" w:hAnsi="Wingdings" w:hint="default"/>
+        <w:sz w:val="20"/>
+      </w:rPr>
+    </w:lvl>
+  </w:abstractNum>
+  <w:abstractNum w:abstractNumId="15" w15:restartNumberingAfterBreak="0">
     <w:nsid w:val="46FE45E8"/>
     <w:multiLevelType w:val="hybridMultilevel"/>
     <w:tmpl w:val="20584132"/>
@@ -5115,7 +8444,7 @@
       </w:pPr>
     </w:lvl>
   </w:abstractNum>
-  <w:abstractNum w:abstractNumId="13" w15:restartNumberingAfterBreak="0">
+  <w:abstractNum w:abstractNumId="16" w15:restartNumberingAfterBreak="0">
     <w:nsid w:val="4708374D"/>
     <w:multiLevelType w:val="hybridMultilevel"/>
     <w:tmpl w:val="73C27C5A"/>
@@ -5201,7 +8530,7 @@
       </w:pPr>
     </w:lvl>
   </w:abstractNum>
-  <w:abstractNum w:abstractNumId="14" w15:restartNumberingAfterBreak="0">
+  <w:abstractNum w:abstractNumId="17" w15:restartNumberingAfterBreak="0">
     <w:nsid w:val="4F3A345A"/>
     <w:multiLevelType w:val="hybridMultilevel"/>
     <w:tmpl w:val="1B1AF7DC"/>
@@ -5287,7 +8616,7 @@
       </w:pPr>
     </w:lvl>
   </w:abstractNum>
-  <w:abstractNum w:abstractNumId="15" w15:restartNumberingAfterBreak="0">
+  <w:abstractNum w:abstractNumId="18" w15:restartNumberingAfterBreak="0">
     <w:nsid w:val="505523F6"/>
     <w:multiLevelType w:val="hybridMultilevel"/>
     <w:tmpl w:val="92229E14"/>
@@ -5373,7 +8702,7 @@
       </w:pPr>
     </w:lvl>
   </w:abstractNum>
-  <w:abstractNum w:abstractNumId="16" w15:restartNumberingAfterBreak="0">
+  <w:abstractNum w:abstractNumId="19" w15:restartNumberingAfterBreak="0">
     <w:nsid w:val="56DA36DF"/>
     <w:multiLevelType w:val="hybridMultilevel"/>
     <w:tmpl w:val="A7B2F288"/>
@@ -5459,7 +8788,7 @@
       </w:pPr>
     </w:lvl>
   </w:abstractNum>
-  <w:abstractNum w:abstractNumId="17" w15:restartNumberingAfterBreak="0">
+  <w:abstractNum w:abstractNumId="20" w15:restartNumberingAfterBreak="0">
     <w:nsid w:val="58655E7C"/>
     <w:multiLevelType w:val="hybridMultilevel"/>
     <w:tmpl w:val="2184407E"/>
@@ -5545,7 +8874,7 @@
       </w:pPr>
     </w:lvl>
   </w:abstractNum>
-  <w:abstractNum w:abstractNumId="18" w15:restartNumberingAfterBreak="0">
+  <w:abstractNum w:abstractNumId="21" w15:restartNumberingAfterBreak="0">
     <w:nsid w:val="5A3A3952"/>
     <w:multiLevelType w:val="multilevel"/>
     <w:tmpl w:val="8B82944A"/>
@@ -5694,7 +9023,305 @@
       </w:rPr>
     </w:lvl>
   </w:abstractNum>
-  <w:abstractNum w:abstractNumId="19" w15:restartNumberingAfterBreak="0">
+  <w:abstractNum w:abstractNumId="22" w15:restartNumberingAfterBreak="0">
+    <w:nsid w:val="5AD67DF5"/>
+    <w:multiLevelType w:val="multilevel"/>
+    <w:tmpl w:val="CEB8EBF4"/>
+    <w:lvl w:ilvl="0">
+      <w:start w:val="1"/>
+      <w:numFmt w:val="bullet"/>
+      <w:lvlText w:val=""/>
+      <w:lvlJc w:val="left"/>
+      <w:pPr>
+        <w:tabs>
+          <w:tab w:val="num" w:pos="720"/>
+        </w:tabs>
+        <w:ind w:left="720" w:hanging="360"/>
+      </w:pPr>
+      <w:rPr>
+        <w:rFonts w:ascii="Symbol" w:hAnsi="Symbol" w:hint="default"/>
+        <w:sz w:val="20"/>
+      </w:rPr>
+    </w:lvl>
+    <w:lvl w:ilvl="1" w:tentative="1">
+      <w:start w:val="1"/>
+      <w:numFmt w:val="bullet"/>
+      <w:lvlText w:val="o"/>
+      <w:lvlJc w:val="left"/>
+      <w:pPr>
+        <w:tabs>
+          <w:tab w:val="num" w:pos="1440"/>
+        </w:tabs>
+        <w:ind w:left="1440" w:hanging="360"/>
+      </w:pPr>
+      <w:rPr>
+        <w:rFonts w:ascii="Courier New" w:hAnsi="Courier New" w:hint="default"/>
+        <w:sz w:val="20"/>
+      </w:rPr>
+    </w:lvl>
+    <w:lvl w:ilvl="2" w:tentative="1">
+      <w:start w:val="1"/>
+      <w:numFmt w:val="bullet"/>
+      <w:lvlText w:val=""/>
+      <w:lvlJc w:val="left"/>
+      <w:pPr>
+        <w:tabs>
+          <w:tab w:val="num" w:pos="2160"/>
+        </w:tabs>
+        <w:ind w:left="2160" w:hanging="360"/>
+      </w:pPr>
+      <w:rPr>
+        <w:rFonts w:ascii="Wingdings" w:hAnsi="Wingdings" w:hint="default"/>
+        <w:sz w:val="20"/>
+      </w:rPr>
+    </w:lvl>
+    <w:lvl w:ilvl="3" w:tentative="1">
+      <w:start w:val="1"/>
+      <w:numFmt w:val="bullet"/>
+      <w:lvlText w:val=""/>
+      <w:lvlJc w:val="left"/>
+      <w:pPr>
+        <w:tabs>
+          <w:tab w:val="num" w:pos="2880"/>
+        </w:tabs>
+        <w:ind w:left="2880" w:hanging="360"/>
+      </w:pPr>
+      <w:rPr>
+        <w:rFonts w:ascii="Wingdings" w:hAnsi="Wingdings" w:hint="default"/>
+        <w:sz w:val="20"/>
+      </w:rPr>
+    </w:lvl>
+    <w:lvl w:ilvl="4" w:tentative="1">
+      <w:start w:val="1"/>
+      <w:numFmt w:val="bullet"/>
+      <w:lvlText w:val=""/>
+      <w:lvlJc w:val="left"/>
+      <w:pPr>
+        <w:tabs>
+          <w:tab w:val="num" w:pos="3600"/>
+        </w:tabs>
+        <w:ind w:left="3600" w:hanging="360"/>
+      </w:pPr>
+      <w:rPr>
+        <w:rFonts w:ascii="Wingdings" w:hAnsi="Wingdings" w:hint="default"/>
+        <w:sz w:val="20"/>
+      </w:rPr>
+    </w:lvl>
+    <w:lvl w:ilvl="5" w:tentative="1">
+      <w:start w:val="1"/>
+      <w:numFmt w:val="bullet"/>
+      <w:lvlText w:val=""/>
+      <w:lvlJc w:val="left"/>
+      <w:pPr>
+        <w:tabs>
+          <w:tab w:val="num" w:pos="4320"/>
+        </w:tabs>
+        <w:ind w:left="4320" w:hanging="360"/>
+      </w:pPr>
+      <w:rPr>
+        <w:rFonts w:ascii="Wingdings" w:hAnsi="Wingdings" w:hint="default"/>
+        <w:sz w:val="20"/>
+      </w:rPr>
+    </w:lvl>
+    <w:lvl w:ilvl="6" w:tentative="1">
+      <w:start w:val="1"/>
+      <w:numFmt w:val="bullet"/>
+      <w:lvlText w:val=""/>
+      <w:lvlJc w:val="left"/>
+      <w:pPr>
+        <w:tabs>
+          <w:tab w:val="num" w:pos="5040"/>
+        </w:tabs>
+        <w:ind w:left="5040" w:hanging="360"/>
+      </w:pPr>
+      <w:rPr>
+        <w:rFonts w:ascii="Wingdings" w:hAnsi="Wingdings" w:hint="default"/>
+        <w:sz w:val="20"/>
+      </w:rPr>
+    </w:lvl>
+    <w:lvl w:ilvl="7" w:tentative="1">
+      <w:start w:val="1"/>
+      <w:numFmt w:val="bullet"/>
+      <w:lvlText w:val=""/>
+      <w:lvlJc w:val="left"/>
+      <w:pPr>
+        <w:tabs>
+          <w:tab w:val="num" w:pos="5760"/>
+        </w:tabs>
+        <w:ind w:left="5760" w:hanging="360"/>
+      </w:pPr>
+      <w:rPr>
+        <w:rFonts w:ascii="Wingdings" w:hAnsi="Wingdings" w:hint="default"/>
+        <w:sz w:val="20"/>
+      </w:rPr>
+    </w:lvl>
+    <w:lvl w:ilvl="8" w:tentative="1">
+      <w:start w:val="1"/>
+      <w:numFmt w:val="bullet"/>
+      <w:lvlText w:val=""/>
+      <w:lvlJc w:val="left"/>
+      <w:pPr>
+        <w:tabs>
+          <w:tab w:val="num" w:pos="6480"/>
+        </w:tabs>
+        <w:ind w:left="6480" w:hanging="360"/>
+      </w:pPr>
+      <w:rPr>
+        <w:rFonts w:ascii="Wingdings" w:hAnsi="Wingdings" w:hint="default"/>
+        <w:sz w:val="20"/>
+      </w:rPr>
+    </w:lvl>
+  </w:abstractNum>
+  <w:abstractNum w:abstractNumId="23" w15:restartNumberingAfterBreak="0">
+    <w:nsid w:val="5AF23A44"/>
+    <w:multiLevelType w:val="multilevel"/>
+    <w:tmpl w:val="F0D00BA8"/>
+    <w:lvl w:ilvl="0">
+      <w:start w:val="1"/>
+      <w:numFmt w:val="bullet"/>
+      <w:lvlText w:val=""/>
+      <w:lvlJc w:val="left"/>
+      <w:pPr>
+        <w:tabs>
+          <w:tab w:val="num" w:pos="720"/>
+        </w:tabs>
+        <w:ind w:left="720" w:hanging="360"/>
+      </w:pPr>
+      <w:rPr>
+        <w:rFonts w:ascii="Symbol" w:hAnsi="Symbol" w:hint="default"/>
+        <w:sz w:val="20"/>
+      </w:rPr>
+    </w:lvl>
+    <w:lvl w:ilvl="1" w:tentative="1">
+      <w:start w:val="1"/>
+      <w:numFmt w:val="bullet"/>
+      <w:lvlText w:val="o"/>
+      <w:lvlJc w:val="left"/>
+      <w:pPr>
+        <w:tabs>
+          <w:tab w:val="num" w:pos="1440"/>
+        </w:tabs>
+        <w:ind w:left="1440" w:hanging="360"/>
+      </w:pPr>
+      <w:rPr>
+        <w:rFonts w:ascii="Courier New" w:hAnsi="Courier New" w:hint="default"/>
+        <w:sz w:val="20"/>
+      </w:rPr>
+    </w:lvl>
+    <w:lvl w:ilvl="2" w:tentative="1">
+      <w:start w:val="1"/>
+      <w:numFmt w:val="bullet"/>
+      <w:lvlText w:val=""/>
+      <w:lvlJc w:val="left"/>
+      <w:pPr>
+        <w:tabs>
+          <w:tab w:val="num" w:pos="2160"/>
+        </w:tabs>
+        <w:ind w:left="2160" w:hanging="360"/>
+      </w:pPr>
+      <w:rPr>
+        <w:rFonts w:ascii="Wingdings" w:hAnsi="Wingdings" w:hint="default"/>
+        <w:sz w:val="20"/>
+      </w:rPr>
+    </w:lvl>
+    <w:lvl w:ilvl="3" w:tentative="1">
+      <w:start w:val="1"/>
+      <w:numFmt w:val="bullet"/>
+      <w:lvlText w:val=""/>
+      <w:lvlJc w:val="left"/>
+      <w:pPr>
+        <w:tabs>
+          <w:tab w:val="num" w:pos="2880"/>
+        </w:tabs>
+        <w:ind w:left="2880" w:hanging="360"/>
+      </w:pPr>
+      <w:rPr>
+        <w:rFonts w:ascii="Wingdings" w:hAnsi="Wingdings" w:hint="default"/>
+        <w:sz w:val="20"/>
+      </w:rPr>
+    </w:lvl>
+    <w:lvl w:ilvl="4" w:tentative="1">
+      <w:start w:val="1"/>
+      <w:numFmt w:val="bullet"/>
+      <w:lvlText w:val=""/>
+      <w:lvlJc w:val="left"/>
+      <w:pPr>
+        <w:tabs>
+          <w:tab w:val="num" w:pos="3600"/>
+        </w:tabs>
+        <w:ind w:left="3600" w:hanging="360"/>
+      </w:pPr>
+      <w:rPr>
+        <w:rFonts w:ascii="Wingdings" w:hAnsi="Wingdings" w:hint="default"/>
+        <w:sz w:val="20"/>
+      </w:rPr>
+    </w:lvl>
+    <w:lvl w:ilvl="5" w:tentative="1">
+      <w:start w:val="1"/>
+      <w:numFmt w:val="bullet"/>
+      <w:lvlText w:val=""/>
+      <w:lvlJc w:val="left"/>
+      <w:pPr>
+        <w:tabs>
+          <w:tab w:val="num" w:pos="4320"/>
+        </w:tabs>
+        <w:ind w:left="4320" w:hanging="360"/>
+      </w:pPr>
+      <w:rPr>
+        <w:rFonts w:ascii="Wingdings" w:hAnsi="Wingdings" w:hint="default"/>
+        <w:sz w:val="20"/>
+      </w:rPr>
+    </w:lvl>
+    <w:lvl w:ilvl="6" w:tentative="1">
+      <w:start w:val="1"/>
+      <w:numFmt w:val="bullet"/>
+      <w:lvlText w:val=""/>
+      <w:lvlJc w:val="left"/>
+      <w:pPr>
+        <w:tabs>
+          <w:tab w:val="num" w:pos="5040"/>
+        </w:tabs>
+        <w:ind w:left="5040" w:hanging="360"/>
+      </w:pPr>
+      <w:rPr>
+        <w:rFonts w:ascii="Wingdings" w:hAnsi="Wingdings" w:hint="default"/>
+        <w:sz w:val="20"/>
+      </w:rPr>
+    </w:lvl>
+    <w:lvl w:ilvl="7" w:tentative="1">
+      <w:start w:val="1"/>
+      <w:numFmt w:val="bullet"/>
+      <w:lvlText w:val=""/>
+      <w:lvlJc w:val="left"/>
+      <w:pPr>
+        <w:tabs>
+          <w:tab w:val="num" w:pos="5760"/>
+        </w:tabs>
+        <w:ind w:left="5760" w:hanging="360"/>
+      </w:pPr>
+      <w:rPr>
+        <w:rFonts w:ascii="Wingdings" w:hAnsi="Wingdings" w:hint="default"/>
+        <w:sz w:val="20"/>
+      </w:rPr>
+    </w:lvl>
+    <w:lvl w:ilvl="8" w:tentative="1">
+      <w:start w:val="1"/>
+      <w:numFmt w:val="bullet"/>
+      <w:lvlText w:val=""/>
+      <w:lvlJc w:val="left"/>
+      <w:pPr>
+        <w:tabs>
+          <w:tab w:val="num" w:pos="6480"/>
+        </w:tabs>
+        <w:ind w:left="6480" w:hanging="360"/>
+      </w:pPr>
+      <w:rPr>
+        <w:rFonts w:ascii="Wingdings" w:hAnsi="Wingdings" w:hint="default"/>
+        <w:sz w:val="20"/>
+      </w:rPr>
+    </w:lvl>
+  </w:abstractNum>
+  <w:abstractNum w:abstractNumId="24" w15:restartNumberingAfterBreak="0">
     <w:nsid w:val="5D6661A0"/>
     <w:multiLevelType w:val="hybridMultilevel"/>
     <w:tmpl w:val="16AC49EA"/>
@@ -5780,7 +9407,7 @@
       </w:pPr>
     </w:lvl>
   </w:abstractNum>
-  <w:abstractNum w:abstractNumId="20" w15:restartNumberingAfterBreak="0">
+  <w:abstractNum w:abstractNumId="25" w15:restartNumberingAfterBreak="0">
     <w:nsid w:val="5F3C54BF"/>
     <w:multiLevelType w:val="hybridMultilevel"/>
     <w:tmpl w:val="CF6ACAD2"/>
@@ -5866,7 +9493,7 @@
       </w:pPr>
     </w:lvl>
   </w:abstractNum>
-  <w:abstractNum w:abstractNumId="21" w15:restartNumberingAfterBreak="0">
+  <w:abstractNum w:abstractNumId="26" w15:restartNumberingAfterBreak="0">
     <w:nsid w:val="5FF032FF"/>
     <w:multiLevelType w:val="multilevel"/>
     <w:tmpl w:val="2AAA3ADE"/>
@@ -6015,7 +9642,7 @@
       </w:rPr>
     </w:lvl>
   </w:abstractNum>
-  <w:abstractNum w:abstractNumId="22" w15:restartNumberingAfterBreak="0">
+  <w:abstractNum w:abstractNumId="27" w15:restartNumberingAfterBreak="0">
     <w:nsid w:val="6A12001E"/>
     <w:multiLevelType w:val="hybridMultilevel"/>
     <w:tmpl w:val="47482C12"/>
@@ -6101,7 +9728,7 @@
       </w:pPr>
     </w:lvl>
   </w:abstractNum>
-  <w:abstractNum w:abstractNumId="23" w15:restartNumberingAfterBreak="0">
+  <w:abstractNum w:abstractNumId="28" w15:restartNumberingAfterBreak="0">
     <w:nsid w:val="6BA7294E"/>
     <w:multiLevelType w:val="hybridMultilevel"/>
     <w:tmpl w:val="8B9E96EA"/>
@@ -6187,7 +9814,7 @@
       </w:pPr>
     </w:lvl>
   </w:abstractNum>
-  <w:abstractNum w:abstractNumId="24" w15:restartNumberingAfterBreak="0">
+  <w:abstractNum w:abstractNumId="29" w15:restartNumberingAfterBreak="0">
     <w:nsid w:val="73D21A66"/>
     <w:multiLevelType w:val="hybridMultilevel"/>
     <w:tmpl w:val="DF86DC96"/>
@@ -6273,7 +9900,7 @@
       </w:pPr>
     </w:lvl>
   </w:abstractNum>
-  <w:abstractNum w:abstractNumId="25" w15:restartNumberingAfterBreak="0">
+  <w:abstractNum w:abstractNumId="30" w15:restartNumberingAfterBreak="0">
     <w:nsid w:val="75353C0E"/>
     <w:multiLevelType w:val="hybridMultilevel"/>
     <w:tmpl w:val="29F26F6A"/>
@@ -6359,7 +9986,7 @@
       </w:pPr>
     </w:lvl>
   </w:abstractNum>
-  <w:abstractNum w:abstractNumId="26" w15:restartNumberingAfterBreak="0">
+  <w:abstractNum w:abstractNumId="31" w15:restartNumberingAfterBreak="0">
     <w:nsid w:val="78134D32"/>
     <w:multiLevelType w:val="hybridMultilevel"/>
     <w:tmpl w:val="9D8C8BA4"/>
@@ -6445,7 +10072,7 @@
       </w:pPr>
     </w:lvl>
   </w:abstractNum>
-  <w:abstractNum w:abstractNumId="27" w15:restartNumberingAfterBreak="0">
+  <w:abstractNum w:abstractNumId="32" w15:restartNumberingAfterBreak="0">
     <w:nsid w:val="7CAA4AE2"/>
     <w:multiLevelType w:val="multilevel"/>
     <w:tmpl w:val="E9DC59DE"/>
@@ -6594,7 +10221,7 @@
       </w:rPr>
     </w:lvl>
   </w:abstractNum>
-  <w:abstractNum w:abstractNumId="28" w15:restartNumberingAfterBreak="0">
+  <w:abstractNum w:abstractNumId="33" w15:restartNumberingAfterBreak="0">
     <w:nsid w:val="7DBF53CD"/>
     <w:multiLevelType w:val="hybridMultilevel"/>
     <w:tmpl w:val="328C85A4"/>
@@ -6680,7 +10307,7 @@
       </w:pPr>
     </w:lvl>
   </w:abstractNum>
-  <w:abstractNum w:abstractNumId="29" w15:restartNumberingAfterBreak="0">
+  <w:abstractNum w:abstractNumId="34" w15:restartNumberingAfterBreak="0">
     <w:nsid w:val="7E1F51D6"/>
     <w:multiLevelType w:val="hybridMultilevel"/>
     <w:tmpl w:val="786C4400"/>
@@ -6766,7 +10393,7 @@
       </w:pPr>
     </w:lvl>
   </w:abstractNum>
-  <w:abstractNum w:abstractNumId="30" w15:restartNumberingAfterBreak="0">
+  <w:abstractNum w:abstractNumId="35" w15:restartNumberingAfterBreak="0">
     <w:nsid w:val="7F135340"/>
     <w:multiLevelType w:val="hybridMultilevel"/>
     <w:tmpl w:val="1C80A518"/>
@@ -6856,16 +10483,16 @@
     <w:abstractNumId w:val="4"/>
   </w:num>
   <w:num w:numId="2" w16cid:durableId="717389571">
-    <w:abstractNumId w:val="26"/>
+    <w:abstractNumId w:val="31"/>
   </w:num>
   <w:num w:numId="3" w16cid:durableId="965693909">
     <w:abstractNumId w:val="0"/>
   </w:num>
   <w:num w:numId="4" w16cid:durableId="359085475">
-    <w:abstractNumId w:val="29"/>
+    <w:abstractNumId w:val="34"/>
   </w:num>
   <w:num w:numId="5" w16cid:durableId="1138298219">
-    <w:abstractNumId w:val="23"/>
+    <w:abstractNumId w:val="28"/>
   </w:num>
   <w:num w:numId="6" w16cid:durableId="1085153168">
     <w:abstractNumId w:val="3"/>
@@ -6877,25 +10504,25 @@
     <w:abstractNumId w:val="1"/>
   </w:num>
   <w:num w:numId="9" w16cid:durableId="342971592">
-    <w:abstractNumId w:val="16"/>
+    <w:abstractNumId w:val="19"/>
   </w:num>
   <w:num w:numId="10" w16cid:durableId="1389183763">
+    <w:abstractNumId w:val="30"/>
+  </w:num>
+  <w:num w:numId="11" w16cid:durableId="20060793">
+    <w:abstractNumId w:val="20"/>
+  </w:num>
+  <w:num w:numId="12" w16cid:durableId="574051552">
     <w:abstractNumId w:val="25"/>
   </w:num>
-  <w:num w:numId="11" w16cid:durableId="20060793">
-    <w:abstractNumId w:val="17"/>
-  </w:num>
-  <w:num w:numId="12" w16cid:durableId="574051552">
-    <w:abstractNumId w:val="20"/>
-  </w:num>
   <w:num w:numId="13" w16cid:durableId="722023370">
-    <w:abstractNumId w:val="28"/>
+    <w:abstractNumId w:val="33"/>
   </w:num>
   <w:num w:numId="14" w16cid:durableId="437220549">
-    <w:abstractNumId w:val="30"/>
+    <w:abstractNumId w:val="35"/>
   </w:num>
   <w:num w:numId="15" w16cid:durableId="968705403">
-    <w:abstractNumId w:val="12"/>
+    <w:abstractNumId w:val="15"/>
   </w:num>
   <w:num w:numId="16" w16cid:durableId="1173379145">
     <w:abstractNumId w:val="5"/>
@@ -6904,7 +10531,7 @@
     <w:abstractNumId w:val="6"/>
   </w:num>
   <w:num w:numId="18" w16cid:durableId="769813716">
-    <w:abstractNumId w:val="18"/>
+    <w:abstractNumId w:val="21"/>
   </w:num>
   <w:num w:numId="19" w16cid:durableId="853424190">
     <w:abstractNumId w:val="7"/>
@@ -6913,25 +10540,25 @@
     <w:abstractNumId w:val="10"/>
   </w:num>
   <w:num w:numId="21" w16cid:durableId="1863588994">
-    <w:abstractNumId w:val="21"/>
+    <w:abstractNumId w:val="26"/>
   </w:num>
   <w:num w:numId="22" w16cid:durableId="390888746">
-    <w:abstractNumId w:val="27"/>
+    <w:abstractNumId w:val="32"/>
   </w:num>
   <w:num w:numId="23" w16cid:durableId="353508035">
-    <w:abstractNumId w:val="14"/>
+    <w:abstractNumId w:val="17"/>
   </w:num>
   <w:num w:numId="24" w16cid:durableId="365953218">
-    <w:abstractNumId w:val="15"/>
+    <w:abstractNumId w:val="18"/>
   </w:num>
   <w:num w:numId="25" w16cid:durableId="1221282839">
-    <w:abstractNumId w:val="13"/>
+    <w:abstractNumId w:val="16"/>
   </w:num>
   <w:num w:numId="26" w16cid:durableId="1569144029">
     <w:abstractNumId w:val="11"/>
   </w:num>
   <w:num w:numId="27" w16cid:durableId="332925574">
-    <w:abstractNumId w:val="22"/>
+    <w:abstractNumId w:val="27"/>
   </w:num>
   <w:num w:numId="28" w16cid:durableId="1526752680">
     <w:abstractNumId w:val="9"/>
@@ -6940,10 +10567,25 @@
     <w:abstractNumId w:val="8"/>
   </w:num>
   <w:num w:numId="30" w16cid:durableId="1584294754">
-    <w:abstractNumId w:val="19"/>
+    <w:abstractNumId w:val="24"/>
   </w:num>
   <w:num w:numId="31" w16cid:durableId="1515924315">
-    <w:abstractNumId w:val="24"/>
+    <w:abstractNumId w:val="29"/>
+  </w:num>
+  <w:num w:numId="32" w16cid:durableId="1243101700">
+    <w:abstractNumId w:val="23"/>
+  </w:num>
+  <w:num w:numId="33" w16cid:durableId="1051491060">
+    <w:abstractNumId w:val="22"/>
+  </w:num>
+  <w:num w:numId="34" w16cid:durableId="2115394434">
+    <w:abstractNumId w:val="14"/>
+  </w:num>
+  <w:num w:numId="35" w16cid:durableId="843055184">
+    <w:abstractNumId w:val="13"/>
+  </w:num>
+  <w:num w:numId="36" w16cid:durableId="1867020242">
+    <w:abstractNumId w:val="12"/>
   </w:num>
 </w:numbering>
 </file>

</xml_diff>